<commit_message>
6C: technical report with the directed graph section, README, PROGRESS and hand-off updates
Updates docs/report and the Word and PDF files (28 pages), adds the three directed-graph
pictures in docs/report_figures, handoff/NEXT_SESSION_PROMPT.md and the new tests in
handoff/collect_checks.m, and updates README.md, PROGRESS.md and CHECKPOINT.md.

Co-Authored-By: Claude Sonnet 5.5 <noreply@anthropic.com>
Claude-Session: https://claude.ai/code/session_01GGSmaKe3gYDHXrfAhnwaju
</commit_message>
<xml_diff>
--- a/docs/Technical_Report.docx
+++ b/docs/Technical_Report.docx
@@ -383,7 +383,7 @@
           <w:sz w:val="22"/>
         </w:rPr>
         <w:tab/>
-        <w:t>6</w:t>
+        <w:t>7</w:t>
       </w:r>
     </w:p>
     <w:p>
@@ -617,7 +617,7 @@
           <w:sz w:val="22"/>
         </w:rPr>
         <w:tab/>
-        <w:t>10</w:t>
+        <w:t>11</w:t>
       </w:r>
     </w:p>
     <w:p>
@@ -921,7 +921,7 @@
           <w:b w:val="0"/>
           <w:sz w:val="22"/>
         </w:rPr>
-        <w:t>5.7  Figures of the network</w:t>
+        <w:t>5.7  The directed graph</w:t>
       </w:r>
       <w:r>
         <w:rPr>
@@ -930,6 +930,32 @@
         </w:rPr>
         <w:tab/>
         <w:t>18</w:t>
+      </w:r>
+    </w:p>
+    <w:p>
+      <w:pPr>
+        <w:pStyle w:val="BodyText"/>
+        <w:tabs>
+          <w:tab w:pos="9026" w:val="right" w:leader="dot"/>
+        </w:tabs>
+        <w:spacing w:after="60" w:before="0" w:line="240" w:lineRule="auto"/>
+        <w:ind w:left="454"/>
+      </w:pPr>
+      <w:r>
+        <w:rPr>
+          <w:rFonts w:ascii="Times New Roman" w:hAnsi="Times New Roman"/>
+          <w:b w:val="0"/>
+          <w:sz w:val="22"/>
+        </w:rPr>
+        <w:t>5.8  Figures of the network</w:t>
+      </w:r>
+      <w:r>
+        <w:rPr>
+          <w:rFonts w:ascii="Times New Roman" w:hAnsi="Times New Roman"/>
+          <w:sz w:val="22"/>
+        </w:rPr>
+        <w:tab/>
+        <w:t>19</w:t>
       </w:r>
     </w:p>
     <w:p>
@@ -955,7 +981,7 @@
           <w:sz w:val="24"/>
         </w:rPr>
         <w:tab/>
-        <w:t>21</w:t>
+        <w:t>23</w:t>
       </w:r>
     </w:p>
     <w:p>
@@ -981,7 +1007,7 @@
           <w:sz w:val="24"/>
         </w:rPr>
         <w:tab/>
-        <w:t>22</w:t>
+        <w:t>24</w:t>
       </w:r>
     </w:p>
     <w:p>
@@ -1007,7 +1033,7 @@
           <w:sz w:val="24"/>
         </w:rPr>
         <w:tab/>
-        <w:t>22</w:t>
+        <w:t>24</w:t>
       </w:r>
     </w:p>
     <w:p>
@@ -1033,7 +1059,7 @@
           <w:sz w:val="24"/>
         </w:rPr>
         <w:tab/>
-        <w:t>23</w:t>
+        <w:t>25</w:t>
       </w:r>
     </w:p>
     <w:p>
@@ -1059,7 +1085,7 @@
           <w:sz w:val="24"/>
         </w:rPr>
         <w:tab/>
-        <w:t>24</w:t>
+        <w:t>26</w:t>
       </w:r>
     </w:p>
     <w:bookmarkStart w:id="20" w:name="abstract"/>
@@ -1116,7 +1142,7 @@
         <w:pStyle w:val="BodyText"/>
       </w:pPr>
       <w:r>
-        <w:t xml:space="preserve">Four areas of discrete mathematics are used as working tools and not only as theory: sets, relations and functions model users, symbols, keys and the cipher; graph theory models and analyses the network; group theory and modular arithmetic give the key exchange and RSA; and number theory (Euclid’s algorithm, fast exponentiation, Lagrange’s theorem) supplies the algorithms. The code has 116 files (about 4,650 lines of base MATLAB with no toolboxes), a test suite of 1,094 automatic checks in 14 test files that all pass in GNU Octave 8.4, and a verification layer that checks every important result a second way with code that shares nothing with the part it checks. Eavesdroppers are simulated on purpose: they break the small examples, which shows why real systems need large numbers. The project is an educational model and not a security product.</w:t>
+        <w:t xml:space="preserve">Four areas of discrete mathematics are used as working tools and not only as theory: sets, relations and functions model users, symbols, keys and the cipher; graph theory models and analyses the network; group theory and modular arithmetic give the key exchange and RSA; and number theory (Euclid’s algorithm, fast exponentiation, Lagrange’s theorem) supplies the algorithms. The code has 128 files (about 5,260 lines of base MATLAB with no toolboxes), a test suite of 1,196 automatic checks in 15 test files that all pass in GNU Octave 8.4, and a verification layer that checks every important result a second way with code that shares nothing with the part it checks. Eavesdroppers are simulated on purpose: they break the small examples, which shows why real systems need large numbers. The project is an educational model and not a security product.</w:t>
       </w:r>
     </w:p>
     <w:p>
@@ -3284,7 +3310,89 @@
         <w:t xml:space="preserve"> </w:t>
       </w:r>
       <w:r>
-        <w:t xml:space="preserve">is symmetric, so an undirected graph is the right model for this network. A directed graph (with arcs</w:t>
+        <w:t xml:space="preserve">is symmetric, so the undirected graph</w:t>
+      </w:r>
+      <w:r>
+        <w:t xml:space="preserve"> </w:t>
+      </w:r>
+      <m:oMath>
+        <m:r>
+          <m:t>G</m:t>
+        </m:r>
+      </m:oMath>
+      <w:r>
+        <w:t xml:space="preserve"> </w:t>
+      </w:r>
+      <w:r>
+        <w:t xml:space="preserve">above is the main model of the network. A</w:t>
+      </w:r>
+      <w:r>
+        <w:t xml:space="preserve"> </w:t>
+      </w:r>
+      <w:r>
+        <w:rPr>
+          <w:bCs/>
+          <w:b/>
+        </w:rPr>
+        <w:t xml:space="preserve">directed graph</w:t>
+      </w:r>
+      <w:r>
+        <w:t xml:space="preserve"> </w:t>
+      </w:r>
+      <w:r>
+        <w:t xml:space="preserve">(digraph)</w:t>
+      </w:r>
+      <w:r>
+        <w:t xml:space="preserve"> </w:t>
+      </w:r>
+      <m:oMath>
+        <m:r>
+          <m:t>D</m:t>
+        </m:r>
+        <m:r>
+          <m:rPr>
+            <m:sty m:val="p"/>
+          </m:rPr>
+          <m:t>=</m:t>
+        </m:r>
+        <m:d>
+          <m:dPr>
+            <m:begChr m:val="("/>
+            <m:endChr m:val=")"/>
+            <m:sepChr m:val=""/>
+            <m:grow/>
+          </m:dPr>
+          <m:e>
+            <m:r>
+              <m:t>V</m:t>
+            </m:r>
+            <m:r>
+              <m:rPr>
+                <m:sty m:val="p"/>
+              </m:rPr>
+              <m:t>,</m:t>
+            </m:r>
+            <m:r>
+              <m:t>A</m:t>
+            </m:r>
+          </m:e>
+        </m:d>
+      </m:oMath>
+      <w:r>
+        <w:t xml:space="preserve"> </w:t>
+      </w:r>
+      <w:r>
+        <w:t xml:space="preserve">is the right model when a channel works in one direction only. Its edges are</w:t>
+      </w:r>
+      <w:r>
+        <w:t xml:space="preserve"> </w:t>
+      </w:r>
+      <w:r>
+        <w:rPr>
+          <w:bCs/>
+          <w:b/>
+        </w:rPr>
+        <w:t xml:space="preserve">arcs</w:t>
       </w:r>
       <w:r>
         <w:t xml:space="preserve"> </w:t>
@@ -3304,7 +3412,606 @@
         </m:r>
       </m:oMath>
       <w:r>
-        <w:t xml:space="preserve">) is the right model when traffic or trust goes one way only. The code in this project uses undirected graphs.</w:t>
+        <w:t xml:space="preserve"> </w:t>
+      </w:r>
+      <w:r>
+        <w:t xml:space="preserve">(user</w:t>
+      </w:r>
+      <w:r>
+        <w:t xml:space="preserve"> </w:t>
+      </w:r>
+      <m:oMath>
+        <m:r>
+          <m:t>u</m:t>
+        </m:r>
+      </m:oMath>
+      <w:r>
+        <w:t xml:space="preserve"> </w:t>
+      </w:r>
+      <w:r>
+        <w:t xml:space="preserve">can send to user</w:t>
+      </w:r>
+      <w:r>
+        <w:t xml:space="preserve"> </w:t>
+      </w:r>
+      <m:oMath>
+        <m:r>
+          <m:t>v</m:t>
+        </m:r>
+      </m:oMath>
+      <w:r>
+        <w:t xml:space="preserve">), its adjacency matrix has</w:t>
+      </w:r>
+      <w:r>
+        <w:t xml:space="preserve"> </w:t>
+      </w:r>
+      <m:oMath>
+        <m:sSub>
+          <m:e>
+            <m:r>
+              <m:t>A</m:t>
+            </m:r>
+          </m:e>
+          <m:sub>
+            <m:r>
+              <m:t>u</m:t>
+            </m:r>
+            <m:r>
+              <m:t>v</m:t>
+            </m:r>
+          </m:sub>
+        </m:sSub>
+        <m:r>
+          <m:rPr>
+            <m:sty m:val="p"/>
+          </m:rPr>
+          <m:t>=</m:t>
+        </m:r>
+        <m:r>
+          <m:t>1</m:t>
+        </m:r>
+      </m:oMath>
+      <w:r>
+        <w:t xml:space="preserve"> </w:t>
+      </w:r>
+      <w:r>
+        <w:t xml:space="preserve">for the arc</w:t>
+      </w:r>
+      <w:r>
+        <w:t xml:space="preserve"> </w:t>
+      </w:r>
+      <m:oMath>
+        <m:r>
+          <m:t>u</m:t>
+        </m:r>
+        <m:r>
+          <m:rPr>
+            <m:sty m:val="p"/>
+          </m:rPr>
+          <m:t>→</m:t>
+        </m:r>
+        <m:r>
+          <m:t>v</m:t>
+        </m:r>
+      </m:oMath>
+      <w:r>
+        <w:t xml:space="preserve"> </w:t>
+      </w:r>
+      <w:r>
+        <w:t xml:space="preserve">and is in general not symmetric, and a two-way channel is the two arcs</w:t>
+      </w:r>
+      <w:r>
+        <w:t xml:space="preserve"> </w:t>
+      </w:r>
+      <m:oMath>
+        <m:r>
+          <m:t>u</m:t>
+        </m:r>
+        <m:r>
+          <m:rPr>
+            <m:sty m:val="p"/>
+          </m:rPr>
+          <m:t>→</m:t>
+        </m:r>
+        <m:r>
+          <m:t>v</m:t>
+        </m:r>
+      </m:oMath>
+      <w:r>
+        <w:t xml:space="preserve"> </w:t>
+      </w:r>
+      <w:r>
+        <w:t xml:space="preserve">and</w:t>
+      </w:r>
+      <w:r>
+        <w:t xml:space="preserve"> </w:t>
+      </w:r>
+      <m:oMath>
+        <m:r>
+          <m:t>v</m:t>
+        </m:r>
+        <m:r>
+          <m:rPr>
+            <m:sty m:val="p"/>
+          </m:rPr>
+          <m:t>→</m:t>
+        </m:r>
+        <m:r>
+          <m:t>u</m:t>
+        </m:r>
+      </m:oMath>
+      <w:r>
+        <w:t xml:space="preserve">. Every vertex has an</w:t>
+      </w:r>
+      <w:r>
+        <w:t xml:space="preserve"> </w:t>
+      </w:r>
+      <w:r>
+        <w:rPr>
+          <w:bCs/>
+          <w:b/>
+        </w:rPr>
+        <w:t xml:space="preserve">out-degree</w:t>
+      </w:r>
+      <w:r>
+        <w:t xml:space="preserve"> </w:t>
+      </w:r>
+      <w:r>
+        <w:t xml:space="preserve">(arcs leaving it) and an</w:t>
+      </w:r>
+      <w:r>
+        <w:t xml:space="preserve"> </w:t>
+      </w:r>
+      <w:r>
+        <w:rPr>
+          <w:bCs/>
+          <w:b/>
+        </w:rPr>
+        <w:t xml:space="preserve">in-degree</w:t>
+      </w:r>
+      <w:r>
+        <w:t xml:space="preserve"> </w:t>
+      </w:r>
+      <w:r>
+        <w:t xml:space="preserve">(arcs entering it), and since every arc leaves one vertex and enters one vertex,</w:t>
+      </w:r>
+    </w:p>
+    <w:p>
+      <w:pPr>
+        <w:pStyle w:val="BodyText"/>
+      </w:pPr>
+      <m:oMathPara>
+        <m:oMathParaPr>
+          <m:jc m:val="center"/>
+        </m:oMathParaPr>
+        <m:oMath>
+          <m:nary>
+            <m:naryPr>
+              <m:chr m:val="∑"/>
+              <m:limLoc m:val="undOvr"/>
+              <m:subHide m:val="off"/>
+              <m:supHide m:val="on"/>
+            </m:naryPr>
+            <m:sub>
+              <m:r>
+                <m:t>v</m:t>
+              </m:r>
+              <m:r>
+                <m:rPr>
+                  <m:sty m:val="p"/>
+                </m:rPr>
+                <m:t>∈</m:t>
+              </m:r>
+              <m:r>
+                <m:t>V</m:t>
+              </m:r>
+            </m:sub>
+            <m:sup>
+              <m:r>
+                <m:t>​</m:t>
+              </m:r>
+            </m:sup>
+            <m:e>
+              <m:sSup>
+                <m:e>
+                  <m:r>
+                    <m:rPr>
+                      <m:sty m:val="p"/>
+                    </m:rPr>
+                    <m:t>deg</m:t>
+                  </m:r>
+                </m:e>
+                <m:sup>
+                  <m:r>
+                    <m:rPr>
+                      <m:sty m:val="p"/>
+                    </m:rPr>
+                    <m:t>+</m:t>
+                  </m:r>
+                </m:sup>
+              </m:sSup>
+            </m:e>
+          </m:nary>
+          <m:d>
+            <m:dPr>
+              <m:begChr m:val="("/>
+              <m:endChr m:val=")"/>
+              <m:sepChr m:val=""/>
+              <m:grow/>
+            </m:dPr>
+            <m:e>
+              <m:r>
+                <m:t>v</m:t>
+              </m:r>
+            </m:e>
+          </m:d>
+          <m:r>
+            <m:rPr>
+              <m:sty m:val="p"/>
+            </m:rPr>
+            <m:t>=</m:t>
+          </m:r>
+          <m:nary>
+            <m:naryPr>
+              <m:chr m:val="∑"/>
+              <m:limLoc m:val="undOvr"/>
+              <m:subHide m:val="off"/>
+              <m:supHide m:val="on"/>
+            </m:naryPr>
+            <m:sub>
+              <m:r>
+                <m:t>v</m:t>
+              </m:r>
+              <m:r>
+                <m:rPr>
+                  <m:sty m:val="p"/>
+                </m:rPr>
+                <m:t>∈</m:t>
+              </m:r>
+              <m:r>
+                <m:t>V</m:t>
+              </m:r>
+            </m:sub>
+            <m:sup>
+              <m:r>
+                <m:t>​</m:t>
+              </m:r>
+            </m:sup>
+            <m:e>
+              <m:sSup>
+                <m:e>
+                  <m:r>
+                    <m:rPr>
+                      <m:sty m:val="p"/>
+                    </m:rPr>
+                    <m:t>deg</m:t>
+                  </m:r>
+                </m:e>
+                <m:sup>
+                  <m:r>
+                    <m:rPr>
+                      <m:sty m:val="p"/>
+                    </m:rPr>
+                    <m:t>−</m:t>
+                  </m:r>
+                </m:sup>
+              </m:sSup>
+            </m:e>
+          </m:nary>
+          <m:d>
+            <m:dPr>
+              <m:begChr m:val="("/>
+              <m:endChr m:val=")"/>
+              <m:sepChr m:val=""/>
+              <m:grow/>
+            </m:dPr>
+            <m:e>
+              <m:r>
+                <m:t>v</m:t>
+              </m:r>
+            </m:e>
+          </m:d>
+          <m:r>
+            <m:rPr>
+              <m:sty m:val="p"/>
+            </m:rPr>
+            <m:t>=</m:t>
+          </m:r>
+          <m:d>
+            <m:dPr>
+              <m:begChr m:val="|"/>
+              <m:endChr m:val="|"/>
+              <m:sepChr m:val=""/>
+              <m:grow/>
+            </m:dPr>
+            <m:e>
+              <m:r>
+                <m:t>A</m:t>
+              </m:r>
+            </m:e>
+          </m:d>
+          <m:r>
+            <m:rPr>
+              <m:sty m:val="p"/>
+            </m:rPr>
+            <m:t>.</m:t>
+          </m:r>
+        </m:oMath>
+      </m:oMathPara>
+    </w:p>
+    <w:p>
+      <w:pPr>
+        <w:pStyle w:val="FirstParagraph"/>
+      </w:pPr>
+      <w:r>
+        <w:t xml:space="preserve">The</w:t>
+      </w:r>
+      <w:r>
+        <w:t xml:space="preserve"> </w:t>
+      </w:r>
+      <w:r>
+        <w:rPr>
+          <w:bCs/>
+          <w:b/>
+        </w:rPr>
+        <w:t xml:space="preserve">directed distance</w:t>
+      </w:r>
+      <w:r>
+        <w:t xml:space="preserve"> </w:t>
+      </w:r>
+      <w:r>
+        <w:t xml:space="preserve">from</w:t>
+      </w:r>
+      <w:r>
+        <w:t xml:space="preserve"> </w:t>
+      </w:r>
+      <m:oMath>
+        <m:r>
+          <m:t>u</m:t>
+        </m:r>
+      </m:oMath>
+      <w:r>
+        <w:t xml:space="preserve"> </w:t>
+      </w:r>
+      <w:r>
+        <w:t xml:space="preserve">to</w:t>
+      </w:r>
+      <w:r>
+        <w:t xml:space="preserve"> </w:t>
+      </w:r>
+      <m:oMath>
+        <m:r>
+          <m:t>v</m:t>
+        </m:r>
+      </m:oMath>
+      <w:r>
+        <w:t xml:space="preserve"> </w:t>
+      </w:r>
+      <w:r>
+        <w:t xml:space="preserve">is the number of arcs of a shortest directed path, and it can differ from the distance from</w:t>
+      </w:r>
+      <w:r>
+        <w:t xml:space="preserve"> </w:t>
+      </w:r>
+      <m:oMath>
+        <m:r>
+          <m:t>v</m:t>
+        </m:r>
+      </m:oMath>
+      <w:r>
+        <w:t xml:space="preserve"> </w:t>
+      </w:r>
+      <w:r>
+        <w:t xml:space="preserve">to</w:t>
+      </w:r>
+      <w:r>
+        <w:t xml:space="preserve"> </w:t>
+      </w:r>
+      <m:oMath>
+        <m:r>
+          <m:t>u</m:t>
+        </m:r>
+      </m:oMath>
+      <w:r>
+        <w:t xml:space="preserve"> </w:t>
+      </w:r>
+      <w:r>
+        <w:t xml:space="preserve">or be infinite in one direction only. Two vertices are in the same</w:t>
+      </w:r>
+      <w:r>
+        <w:t xml:space="preserve"> </w:t>
+      </w:r>
+      <w:r>
+        <w:rPr>
+          <w:bCs/>
+          <w:b/>
+        </w:rPr>
+        <w:t xml:space="preserve">strongly connected component</w:t>
+      </w:r>
+      <w:r>
+        <w:t xml:space="preserve"> </w:t>
+      </w:r>
+      <w:r>
+        <w:t xml:space="preserve">when each can be reached from the other along arcs; the</w:t>
+      </w:r>
+      <w:r>
+        <w:t xml:space="preserve"> </w:t>
+      </w:r>
+      <w:r>
+        <w:rPr>
+          <w:bCs/>
+          <w:b/>
+        </w:rPr>
+        <w:t xml:space="preserve">weakly connected components</w:t>
+      </w:r>
+      <w:r>
+        <w:t xml:space="preserve"> </w:t>
+      </w:r>
+      <w:r>
+        <w:t xml:space="preserve">are the components of the graph that is left when the directions are ignored. The reachability of all pairs can also be found with</w:t>
+      </w:r>
+      <w:r>
+        <w:t xml:space="preserve"> </w:t>
+      </w:r>
+      <w:r>
+        <w:rPr>
+          <w:bCs/>
+          <w:b/>
+        </w:rPr>
+        <w:t xml:space="preserve">Warshall’s algorithm</w:t>
+      </w:r>
+      <w:r>
+        <w:t xml:space="preserve">, which for</w:t>
+      </w:r>
+      <w:r>
+        <w:t xml:space="preserve"> </w:t>
+      </w:r>
+      <m:oMath>
+        <m:r>
+          <m:t>k</m:t>
+        </m:r>
+        <m:r>
+          <m:rPr>
+            <m:sty m:val="p"/>
+          </m:rPr>
+          <m:t>=</m:t>
+        </m:r>
+        <m:r>
+          <m:t>1</m:t>
+        </m:r>
+        <m:r>
+          <m:rPr>
+            <m:sty m:val="p"/>
+          </m:rPr>
+          <m:t>,</m:t>
+        </m:r>
+        <m:r>
+          <m:rPr>
+            <m:sty m:val="p"/>
+          </m:rPr>
+          <m:t>…</m:t>
+        </m:r>
+        <m:r>
+          <m:rPr>
+            <m:sty m:val="p"/>
+          </m:rPr>
+          <m:t>,</m:t>
+        </m:r>
+        <m:r>
+          <m:t>n</m:t>
+        </m:r>
+      </m:oMath>
+      <w:r>
+        <w:t xml:space="preserve"> </w:t>
+      </w:r>
+      <w:r>
+        <w:t xml:space="preserve">adds the path</w:t>
+      </w:r>
+      <w:r>
+        <w:t xml:space="preserve"> </w:t>
+      </w:r>
+      <m:oMath>
+        <m:r>
+          <m:t>i</m:t>
+        </m:r>
+        <m:r>
+          <m:rPr>
+            <m:sty m:val="p"/>
+          </m:rPr>
+          <m:t>→</m:t>
+        </m:r>
+        <m:r>
+          <m:t>k</m:t>
+        </m:r>
+        <m:r>
+          <m:rPr>
+            <m:sty m:val="p"/>
+          </m:rPr>
+          <m:t>→</m:t>
+        </m:r>
+        <m:r>
+          <m:t>j</m:t>
+        </m:r>
+      </m:oMath>
+      <w:r>
+        <w:t xml:space="preserve"> </w:t>
+      </w:r>
+      <w:r>
+        <w:t xml:space="preserve">whenever both</w:t>
+      </w:r>
+      <w:r>
+        <w:t xml:space="preserve"> </w:t>
+      </w:r>
+      <m:oMath>
+        <m:r>
+          <m:t>i</m:t>
+        </m:r>
+        <m:r>
+          <m:rPr>
+            <m:sty m:val="p"/>
+          </m:rPr>
+          <m:t>→</m:t>
+        </m:r>
+        <m:r>
+          <m:t>k</m:t>
+        </m:r>
+      </m:oMath>
+      <w:r>
+        <w:t xml:space="preserve"> </w:t>
+      </w:r>
+      <w:r>
+        <w:t xml:space="preserve">and</w:t>
+      </w:r>
+      <w:r>
+        <w:t xml:space="preserve"> </w:t>
+      </w:r>
+      <m:oMath>
+        <m:r>
+          <m:t>k</m:t>
+        </m:r>
+        <m:r>
+          <m:rPr>
+            <m:sty m:val="p"/>
+          </m:rPr>
+          <m:t>→</m:t>
+        </m:r>
+        <m:r>
+          <m:t>j</m:t>
+        </m:r>
+      </m:oMath>
+      <w:r>
+        <w:t xml:space="preserve"> </w:t>
+      </w:r>
+      <w:r>
+        <w:t xml:space="preserve">are known. The project models the network both ways: as the undirected graph</w:t>
+      </w:r>
+      <w:r>
+        <w:t xml:space="preserve"> </w:t>
+      </w:r>
+      <m:oMath>
+        <m:r>
+          <m:t>G</m:t>
+        </m:r>
+      </m:oMath>
+      <w:r>
+        <w:t xml:space="preserve"> </w:t>
+      </w:r>
+      <w:r>
+        <w:t xml:space="preserve">and as a directed version</w:t>
+      </w:r>
+      <w:r>
+        <w:t xml:space="preserve"> </w:t>
+      </w:r>
+      <m:oMath>
+        <m:r>
+          <m:t>D</m:t>
+        </m:r>
+      </m:oMath>
+      <w:r>
+        <w:t xml:space="preserve"> </w:t>
+      </w:r>
+      <w:r>
+        <w:t xml:space="preserve">of the same six channels (Section 5.7).</w:t>
       </w:r>
     </w:p>
     <w:bookmarkEnd w:id="27"/>
@@ -7114,7 +7821,7 @@
         <w:pStyle w:val="TableCaption"/>
       </w:pPr>
       <w:r>
-        <w:t xml:space="preserve">Table 2. The modules of the code (116 files, 4,647 lines in all; the tests add 20 files and 3,654 lines).</w:t>
+        <w:t xml:space="preserve">Table 2. The modules of the code (128 files, 5,259 lines in all; the tests add 22 files and 3,947 lines).</w:t>
       </w:r>
     </w:p>
     <w:tbl>
@@ -7138,7 +7845,7 @@
           <w:right w:w="80" w:type="dxa"/>
         </w:tblCellMar>
         <w:tblLook w:firstRow="1" w:lastRow="0" w:firstColumn="0" w:lastColumn="0" w:noHBand="0" w:noVBand="0" w:val="0020"/>
-        <w:tblCaption w:val="Table 2. The modules of the code (116 files, 4,647 lines in all; the tests add 20 files and 3,654 lines)."/>
+        <w:tblCaption w:val="Table 2. The modules of the code (128 files, 5,259 lines in all; the tests add 22 files and 3,947 lines)."/>
       </w:tblPr>
       <w:tblGrid>
         <w:gridCol w:w="2409"/>
@@ -7484,7 +8191,7 @@
               <w:rPr>
                 <w:sz w:val="20"/>
               </w:rPr>
-              <w:t xml:space="preserve">Graph, adjacency matrix and list, BFS, paths, cycles, bridges, pictures</w:t>
+              <w:t xml:space="preserve">Graph and directed graph, adjacency matrix and list, BFS, paths, cycles, bridges, strong components, pictures</w:t>
             </w:r>
           </w:p>
         </w:tc>
@@ -7503,7 +8210,7 @@
               <w:rPr>
                 <w:sz w:val="20"/>
               </w:rPr>
-              <w:t xml:space="preserve">31</w:t>
+              <w:t xml:space="preserve">43</w:t>
             </w:r>
           </w:p>
         </w:tc>
@@ -7522,7 +8229,7 @@
               <w:rPr>
                 <w:sz w:val="20"/>
               </w:rPr>
-              <w:t xml:space="preserve">931</w:t>
+              <w:t xml:space="preserve">1,543</w:t>
             </w:r>
           </w:p>
         </w:tc>
@@ -8737,6 +9444,140 @@
         <w:t xml:space="preserve">draws the picture. Five pictures are made: the network, the shortest path, a shortest cycle, the weak points (bridges red, cut users orange) and the network after the first bridge is removed.</w:t>
       </w:r>
     </w:p>
+    <w:p>
+      <w:pPr>
+        <w:pStyle w:val="BodyText"/>
+      </w:pPr>
+      <w:r>
+        <w:t xml:space="preserve">The directed version is built by</w:t>
+      </w:r>
+      <w:r>
+        <w:t xml:space="preserve"> </w:t>
+      </w:r>
+      <w:r>
+        <w:rPr>
+          <w:rStyle w:val="VerbatimChar"/>
+        </w:rPr>
+        <w:t xml:space="preserve">define_digraph</w:t>
+      </w:r>
+      <w:r>
+        <w:t xml:space="preserve">, which gives each of the six channels one arc or two arcs (the default is a list of 8 arcs, sorted by tail and then head, so the arc numbers a1 to a8 never change) and refuses an arc between users without a channel.</w:t>
+      </w:r>
+      <w:r>
+        <w:t xml:space="preserve"> </w:t>
+      </w:r>
+      <w:r>
+        <w:rPr>
+          <w:rStyle w:val="VerbatimChar"/>
+        </w:rPr>
+        <w:t xml:space="preserve">bfs_search</w:t>
+      </w:r>
+      <w:r>
+        <w:t xml:space="preserve">,</w:t>
+      </w:r>
+      <w:r>
+        <w:t xml:space="preserve"> </w:t>
+      </w:r>
+      <w:r>
+        <w:rPr>
+          <w:rStyle w:val="VerbatimChar"/>
+        </w:rPr>
+        <w:t xml:space="preserve">shortest_path</w:t>
+      </w:r>
+      <w:r>
+        <w:t xml:space="preserve">,</w:t>
+      </w:r>
+      <w:r>
+        <w:t xml:space="preserve"> </w:t>
+      </w:r>
+      <w:r>
+        <w:rPr>
+          <w:rStyle w:val="VerbatimChar"/>
+        </w:rPr>
+        <w:t xml:space="preserve">distance_matrix</w:t>
+      </w:r>
+      <w:r>
+        <w:t xml:space="preserve"> </w:t>
+      </w:r>
+      <w:r>
+        <w:t xml:space="preserve">and</w:t>
+      </w:r>
+      <w:r>
+        <w:t xml:space="preserve"> </w:t>
+      </w:r>
+      <w:r>
+        <w:rPr>
+          <w:rStyle w:val="VerbatimChar"/>
+        </w:rPr>
+        <w:t xml:space="preserve">reachable_from</w:t>
+      </w:r>
+      <w:r>
+        <w:t xml:space="preserve"> </w:t>
+      </w:r>
+      <w:r>
+        <w:t xml:space="preserve">follow the row of the adjacency matrix, which holds the arcs that leave a vertex, so they work on a digraph without any change.</w:t>
+      </w:r>
+      <w:r>
+        <w:t xml:space="preserve"> </w:t>
+      </w:r>
+      <w:r>
+        <w:rPr>
+          <w:rStyle w:val="VerbatimChar"/>
+        </w:rPr>
+        <w:t xml:space="preserve">strong_components</w:t>
+      </w:r>
+      <w:r>
+        <w:t xml:space="preserve"> </w:t>
+      </w:r>
+      <w:r>
+        <w:t xml:space="preserve">puts two users in one group when each is reachable from the other.</w:t>
+      </w:r>
+      <w:r>
+        <w:t xml:space="preserve"> </w:t>
+      </w:r>
+      <w:r>
+        <w:rPr>
+          <w:rStyle w:val="VerbatimChar"/>
+        </w:rPr>
+        <w:t xml:space="preserve">show_digraph</w:t>
+      </w:r>
+      <w:r>
+        <w:t xml:space="preserve"> </w:t>
+      </w:r>
+      <w:r>
+        <w:t xml:space="preserve">prints the whole digraph and checks it, among other ways with Warshall’s algorithm written as three plain loops that share no code with the breadth-first search.</w:t>
+      </w:r>
+      <w:r>
+        <w:t xml:space="preserve"> </w:t>
+      </w:r>
+      <w:r>
+        <w:rPr>
+          <w:rStyle w:val="VerbatimChar"/>
+        </w:rPr>
+        <w:t xml:space="preserve">draw_digraph</w:t>
+      </w:r>
+      <w:r>
+        <w:t xml:space="preserve"> </w:t>
+      </w:r>
+      <w:r>
+        <w:t xml:space="preserve">draws every arc as an arrow with a filled head; the two arrows of a two-way channel run side by side, and</w:t>
+      </w:r>
+      <w:r>
+        <w:t xml:space="preserve"> </w:t>
+      </w:r>
+      <w:r>
+        <w:rPr>
+          <w:rStyle w:val="VerbatimChar"/>
+        </w:rPr>
+        <w:t xml:space="preserve">arrow_points</w:t>
+      </w:r>
+      <w:r>
+        <w:t xml:space="preserve"> </w:t>
+      </w:r>
+      <w:r>
+        <w:t xml:space="preserve">computes the ends and the corners of each arrowhead.</w:t>
+      </w:r>
+    </w:p>
     <w:bookmarkEnd w:id="41"/>
     <w:bookmarkStart w:id="42" w:name="X21e2182bcfdab21bfc5640305f92e671240a194"/>
     <w:p>
@@ -10422,7 +11263,7 @@
     </w:p>
     <w:bookmarkEnd w:id="52"/>
     <w:bookmarkEnd w:id="53"/>
-    <w:bookmarkStart w:id="85" w:name="results-and-verification"/>
+    <w:bookmarkStart w:id="95" w:name="results-and-verification"/>
     <w:p>
       <w:pPr>
         <w:pStyle w:val="Heading1"/>
@@ -10463,7 +11304,7 @@
         <w:pStyle w:val="FirstParagraph"/>
       </w:pPr>
       <w:r>
-        <w:t xml:space="preserve">Every part has a test file of automatic checks that print PASS or FAIL lines. All 14 test files that need no figure window were run in GNU Octave 8.4 and every check passed.</w:t>
+        <w:t xml:space="preserve">Every part has a test file of automatic checks that print PASS or FAIL lines. All 15 test files that need no figure window were run in GNU Octave 8.4 and every check passed.</w:t>
       </w:r>
     </w:p>
     <w:p>
@@ -10498,9 +11339,9 @@
         <w:tblCaption w:val="Table 3. Results of the test suite in GNU Octave 8.4."/>
       </w:tblPr>
       <w:tblGrid>
-        <w:gridCol w:w="3028"/>
-        <w:gridCol w:w="4412"/>
-        <w:gridCol w:w="1586"/>
+        <w:gridCol w:w="2753"/>
+        <w:gridCol w:w="4831"/>
+        <w:gridCol w:w="1442"/>
       </w:tblGrid>
       <w:tr>
         <w:trPr>
@@ -10510,7 +11351,7 @@
         </w:trPr>
         <w:tc>
           <w:tcPr>
-            <w:tcW w:type="dxa" w:w="3028"/>
+            <w:tcW w:type="dxa" w:w="2753"/>
             <w:shd w:val="clear" w:color="auto" w:fill="E7E6E6"/>
           </w:tcPr>
           <w:p>
@@ -10531,7 +11372,7 @@
         </w:tc>
         <w:tc>
           <w:tcPr>
-            <w:tcW w:type="dxa" w:w="4412"/>
+            <w:tcW w:type="dxa" w:w="4831"/>
             <w:shd w:val="clear" w:color="auto" w:fill="E7E6E6"/>
           </w:tcPr>
           <w:p>
@@ -10552,7 +11393,7 @@
         </w:tc>
         <w:tc>
           <w:tcPr>
-            <w:tcW w:type="dxa" w:w="1586"/>
+            <w:tcW w:type="dxa" w:w="1442"/>
             <w:shd w:val="clear" w:color="auto" w:fill="E7E6E6"/>
           </w:tcPr>
           <w:p>
@@ -10578,7 +11419,7 @@
         </w:trPr>
         <w:tc>
           <w:tcPr>
-            <w:tcW w:type="dxa" w:w="3028"/>
+            <w:tcW w:type="dxa" w:w="2753"/>
           </w:tcPr>
           <w:p>
             <w:pPr>
@@ -10598,7 +11439,7 @@
         </w:tc>
         <w:tc>
           <w:tcPr>
-            <w:tcW w:type="dxa" w:w="4412"/>
+            <w:tcW w:type="dxa" w:w="4831"/>
           </w:tcPr>
           <w:p>
             <w:pPr>
@@ -10617,7 +11458,7 @@
         </w:tc>
         <w:tc>
           <w:tcPr>
-            <w:tcW w:type="dxa" w:w="1586"/>
+            <w:tcW w:type="dxa" w:w="1442"/>
           </w:tcPr>
           <w:p>
             <w:pPr>
@@ -10641,7 +11482,7 @@
         </w:trPr>
         <w:tc>
           <w:tcPr>
-            <w:tcW w:type="dxa" w:w="3028"/>
+            <w:tcW w:type="dxa" w:w="2753"/>
           </w:tcPr>
           <w:p>
             <w:pPr>
@@ -10661,7 +11502,7 @@
         </w:tc>
         <w:tc>
           <w:tcPr>
-            <w:tcW w:type="dxa" w:w="4412"/>
+            <w:tcW w:type="dxa" w:w="4831"/>
           </w:tcPr>
           <w:p>
             <w:pPr>
@@ -10680,7 +11521,7 @@
         </w:tc>
         <w:tc>
           <w:tcPr>
-            <w:tcW w:type="dxa" w:w="1586"/>
+            <w:tcW w:type="dxa" w:w="1442"/>
           </w:tcPr>
           <w:p>
             <w:pPr>
@@ -10704,7 +11545,7 @@
         </w:trPr>
         <w:tc>
           <w:tcPr>
-            <w:tcW w:type="dxa" w:w="3028"/>
+            <w:tcW w:type="dxa" w:w="2753"/>
           </w:tcPr>
           <w:p>
             <w:pPr>
@@ -10724,7 +11565,7 @@
         </w:tc>
         <w:tc>
           <w:tcPr>
-            <w:tcW w:type="dxa" w:w="4412"/>
+            <w:tcW w:type="dxa" w:w="4831"/>
           </w:tcPr>
           <w:p>
             <w:pPr>
@@ -10743,7 +11584,7 @@
         </w:tc>
         <w:tc>
           <w:tcPr>
-            <w:tcW w:type="dxa" w:w="1586"/>
+            <w:tcW w:type="dxa" w:w="1442"/>
           </w:tcPr>
           <w:p>
             <w:pPr>
@@ -10767,7 +11608,7 @@
         </w:trPr>
         <w:tc>
           <w:tcPr>
-            <w:tcW w:type="dxa" w:w="3028"/>
+            <w:tcW w:type="dxa" w:w="2753"/>
           </w:tcPr>
           <w:p>
             <w:pPr>
@@ -10787,7 +11628,7 @@
         </w:tc>
         <w:tc>
           <w:tcPr>
-            <w:tcW w:type="dxa" w:w="4412"/>
+            <w:tcW w:type="dxa" w:w="4831"/>
           </w:tcPr>
           <w:p>
             <w:pPr>
@@ -10806,7 +11647,7 @@
         </w:tc>
         <w:tc>
           <w:tcPr>
-            <w:tcW w:type="dxa" w:w="1586"/>
+            <w:tcW w:type="dxa" w:w="1442"/>
           </w:tcPr>
           <w:p>
             <w:pPr>
@@ -10830,7 +11671,7 @@
         </w:trPr>
         <w:tc>
           <w:tcPr>
-            <w:tcW w:type="dxa" w:w="3028"/>
+            <w:tcW w:type="dxa" w:w="2753"/>
           </w:tcPr>
           <w:p>
             <w:pPr>
@@ -10844,13 +11685,13 @@
                 <w:rStyle w:val="VerbatimChar"/>
                 <w:sz w:val="18"/>
               </w:rPr>
-              <w:t xml:space="preserve">test_modular</w:t>
-            </w:r>
-          </w:p>
-        </w:tc>
-        <w:tc>
-          <w:tcPr>
-            <w:tcW w:type="dxa" w:w="4412"/>
+              <w:t xml:space="preserve">test_digraph</w:t>
+            </w:r>
+          </w:p>
+        </w:tc>
+        <w:tc>
+          <w:tcPr>
+            <w:tcW w:type="dxa" w:w="4831"/>
           </w:tcPr>
           <w:p>
             <w:pPr>
@@ -10863,13 +11704,13 @@
               <w:rPr>
                 <w:sz w:val="20"/>
               </w:rPr>
-              <w:t xml:space="preserve">Fast power, gcd, inverse</w:t>
-            </w:r>
-          </w:p>
-        </w:tc>
-        <w:tc>
-          <w:tcPr>
-            <w:tcW w:type="dxa" w:w="1586"/>
+              <w:t xml:space="preserve">Directed graph, strong components, arrows, picture options</w:t>
+            </w:r>
+          </w:p>
+        </w:tc>
+        <w:tc>
+          <w:tcPr>
+            <w:tcW w:type="dxa" w:w="1442"/>
           </w:tcPr>
           <w:p>
             <w:pPr>
@@ -10882,7 +11723,7 @@
               <w:rPr>
                 <w:sz w:val="20"/>
               </w:rPr>
-              <w:t xml:space="preserve">130 of 130</w:t>
+              <w:t xml:space="preserve">102 of 102</w:t>
             </w:r>
           </w:p>
         </w:tc>
@@ -10893,7 +11734,7 @@
         </w:trPr>
         <w:tc>
           <w:tcPr>
-            <w:tcW w:type="dxa" w:w="3028"/>
+            <w:tcW w:type="dxa" w:w="2753"/>
           </w:tcPr>
           <w:p>
             <w:pPr>
@@ -10907,13 +11748,13 @@
                 <w:rStyle w:val="VerbatimChar"/>
                 <w:sz w:val="18"/>
               </w:rPr>
-              <w:t xml:space="preserve">test_group</w:t>
-            </w:r>
-          </w:p>
-        </w:tc>
-        <w:tc>
-          <w:tcPr>
-            <w:tcW w:type="dxa" w:w="4412"/>
+              <w:t xml:space="preserve">test_modular</w:t>
+            </w:r>
+          </w:p>
+        </w:tc>
+        <w:tc>
+          <w:tcPr>
+            <w:tcW w:type="dxa" w:w="4831"/>
           </w:tcPr>
           <w:p>
             <w:pPr>
@@ -10926,13 +11767,13 @@
               <w:rPr>
                 <w:sz w:val="20"/>
               </w:rPr>
-              <w:t xml:space="preserve">Group rules, orders, generators</w:t>
-            </w:r>
-          </w:p>
-        </w:tc>
-        <w:tc>
-          <w:tcPr>
-            <w:tcW w:type="dxa" w:w="1586"/>
+              <w:t xml:space="preserve">Fast power, gcd, inverse</w:t>
+            </w:r>
+          </w:p>
+        </w:tc>
+        <w:tc>
+          <w:tcPr>
+            <w:tcW w:type="dxa" w:w="1442"/>
           </w:tcPr>
           <w:p>
             <w:pPr>
@@ -10945,7 +11786,7 @@
               <w:rPr>
                 <w:sz w:val="20"/>
               </w:rPr>
-              <w:t xml:space="preserve">131 of 131</w:t>
+              <w:t xml:space="preserve">130 of 130</w:t>
             </w:r>
           </w:p>
         </w:tc>
@@ -10956,7 +11797,7 @@
         </w:trPr>
         <w:tc>
           <w:tcPr>
-            <w:tcW w:type="dxa" w:w="3028"/>
+            <w:tcW w:type="dxa" w:w="2753"/>
           </w:tcPr>
           <w:p>
             <w:pPr>
@@ -10970,13 +11811,13 @@
                 <w:rStyle w:val="VerbatimChar"/>
                 <w:sz w:val="18"/>
               </w:rPr>
-              <w:t xml:space="preserve">test_dh</w:t>
-            </w:r>
-          </w:p>
-        </w:tc>
-        <w:tc>
-          <w:tcPr>
-            <w:tcW w:type="dxa" w:w="4412"/>
+              <w:t xml:space="preserve">test_group</w:t>
+            </w:r>
+          </w:p>
+        </w:tc>
+        <w:tc>
+          <w:tcPr>
+            <w:tcW w:type="dxa" w:w="4831"/>
           </w:tcPr>
           <w:p>
             <w:pPr>
@@ -10989,13 +11830,13 @@
               <w:rPr>
                 <w:sz w:val="20"/>
               </w:rPr>
-              <w:t xml:space="preserve">Diffie–Hellman</w:t>
-            </w:r>
-          </w:p>
-        </w:tc>
-        <w:tc>
-          <w:tcPr>
-            <w:tcW w:type="dxa" w:w="1586"/>
+              <w:t xml:space="preserve">Group rules, orders, generators</w:t>
+            </w:r>
+          </w:p>
+        </w:tc>
+        <w:tc>
+          <w:tcPr>
+            <w:tcW w:type="dxa" w:w="1442"/>
           </w:tcPr>
           <w:p>
             <w:pPr>
@@ -11008,7 +11849,7 @@
               <w:rPr>
                 <w:sz w:val="20"/>
               </w:rPr>
-              <w:t xml:space="preserve">71 of 71</w:t>
+              <w:t xml:space="preserve">131 of 131</w:t>
             </w:r>
           </w:p>
         </w:tc>
@@ -11019,7 +11860,7 @@
         </w:trPr>
         <w:tc>
           <w:tcPr>
-            <w:tcW w:type="dxa" w:w="3028"/>
+            <w:tcW w:type="dxa" w:w="2753"/>
           </w:tcPr>
           <w:p>
             <w:pPr>
@@ -11033,13 +11874,13 @@
                 <w:rStyle w:val="VerbatimChar"/>
                 <w:sz w:val="18"/>
               </w:rPr>
-              <w:t xml:space="preserve">test_encryption</w:t>
-            </w:r>
-          </w:p>
-        </w:tc>
-        <w:tc>
-          <w:tcPr>
-            <w:tcW w:type="dxa" w:w="4412"/>
+              <w:t xml:space="preserve">test_dh</w:t>
+            </w:r>
+          </w:p>
+        </w:tc>
+        <w:tc>
+          <w:tcPr>
+            <w:tcW w:type="dxa" w:w="4831"/>
           </w:tcPr>
           <w:p>
             <w:pPr>
@@ -11052,13 +11893,13 @@
               <w:rPr>
                 <w:sz w:val="20"/>
               </w:rPr>
-              <w:t xml:space="preserve">Encryption with the shared key, eavesdroppers</w:t>
-            </w:r>
-          </w:p>
-        </w:tc>
-        <w:tc>
-          <w:tcPr>
-            <w:tcW w:type="dxa" w:w="1586"/>
+              <w:t xml:space="preserve">Diffie–Hellman</w:t>
+            </w:r>
+          </w:p>
+        </w:tc>
+        <w:tc>
+          <w:tcPr>
+            <w:tcW w:type="dxa" w:w="1442"/>
           </w:tcPr>
           <w:p>
             <w:pPr>
@@ -11071,7 +11912,7 @@
               <w:rPr>
                 <w:sz w:val="20"/>
               </w:rPr>
-              <w:t xml:space="preserve">101 of 101</w:t>
+              <w:t xml:space="preserve">71 of 71</w:t>
             </w:r>
           </w:p>
         </w:tc>
@@ -11082,7 +11923,7 @@
         </w:trPr>
         <w:tc>
           <w:tcPr>
-            <w:tcW w:type="dxa" w:w="3028"/>
+            <w:tcW w:type="dxa" w:w="2753"/>
           </w:tcPr>
           <w:p>
             <w:pPr>
@@ -11096,13 +11937,13 @@
                 <w:rStyle w:val="VerbatimChar"/>
                 <w:sz w:val="18"/>
               </w:rPr>
-              <w:t xml:space="preserve">test_system</w:t>
-            </w:r>
-          </w:p>
-        </w:tc>
-        <w:tc>
-          <w:tcPr>
-            <w:tcW w:type="dxa" w:w="4412"/>
+              <w:t xml:space="preserve">test_encryption</w:t>
+            </w:r>
+          </w:p>
+        </w:tc>
+        <w:tc>
+          <w:tcPr>
+            <w:tcW w:type="dxa" w:w="4831"/>
           </w:tcPr>
           <w:p>
             <w:pPr>
@@ -11115,13 +11956,13 @@
               <w:rPr>
                 <w:sz w:val="20"/>
               </w:rPr>
-              <w:t xml:space="preserve">Secure network and routing</w:t>
-            </w:r>
-          </w:p>
-        </w:tc>
-        <w:tc>
-          <w:tcPr>
-            <w:tcW w:type="dxa" w:w="1586"/>
+              <w:t xml:space="preserve">Encryption with the shared key, eavesdroppers</w:t>
+            </w:r>
+          </w:p>
+        </w:tc>
+        <w:tc>
+          <w:tcPr>
+            <w:tcW w:type="dxa" w:w="1442"/>
           </w:tcPr>
           <w:p>
             <w:pPr>
@@ -11134,7 +11975,7 @@
               <w:rPr>
                 <w:sz w:val="20"/>
               </w:rPr>
-              <w:t xml:space="preserve">69 of 69</w:t>
+              <w:t xml:space="preserve">101 of 101</w:t>
             </w:r>
           </w:p>
         </w:tc>
@@ -11145,7 +11986,7 @@
         </w:trPr>
         <w:tc>
           <w:tcPr>
-            <w:tcW w:type="dxa" w:w="3028"/>
+            <w:tcW w:type="dxa" w:w="2753"/>
           </w:tcPr>
           <w:p>
             <w:pPr>
@@ -11159,13 +12000,13 @@
                 <w:rStyle w:val="VerbatimChar"/>
                 <w:sz w:val="18"/>
               </w:rPr>
-              <w:t xml:space="preserve">test_verification</w:t>
-            </w:r>
-          </w:p>
-        </w:tc>
-        <w:tc>
-          <w:tcPr>
-            <w:tcW w:type="dxa" w:w="4412"/>
+              <w:t xml:space="preserve">test_system</w:t>
+            </w:r>
+          </w:p>
+        </w:tc>
+        <w:tc>
+          <w:tcPr>
+            <w:tcW w:type="dxa" w:w="4831"/>
           </w:tcPr>
           <w:p>
             <w:pPr>
@@ -11178,13 +12019,13 @@
               <w:rPr>
                 <w:sz w:val="20"/>
               </w:rPr>
-              <w:t xml:space="preserve">Verification of key, decryption and graph</w:t>
-            </w:r>
-          </w:p>
-        </w:tc>
-        <w:tc>
-          <w:tcPr>
-            <w:tcW w:type="dxa" w:w="1586"/>
+              <w:t xml:space="preserve">Secure network and routing</w:t>
+            </w:r>
+          </w:p>
+        </w:tc>
+        <w:tc>
+          <w:tcPr>
+            <w:tcW w:type="dxa" w:w="1442"/>
           </w:tcPr>
           <w:p>
             <w:pPr>
@@ -11197,7 +12038,7 @@
               <w:rPr>
                 <w:sz w:val="20"/>
               </w:rPr>
-              <w:t xml:space="preserve">32 of 32</w:t>
+              <w:t xml:space="preserve">69 of 69</w:t>
             </w:r>
           </w:p>
         </w:tc>
@@ -11208,7 +12049,7 @@
         </w:trPr>
         <w:tc>
           <w:tcPr>
-            <w:tcW w:type="dxa" w:w="3028"/>
+            <w:tcW w:type="dxa" w:w="2753"/>
           </w:tcPr>
           <w:p>
             <w:pPr>
@@ -11222,13 +12063,13 @@
                 <w:rStyle w:val="VerbatimChar"/>
                 <w:sz w:val="18"/>
               </w:rPr>
-              <w:t xml:space="preserve">test_rsa</w:t>
-            </w:r>
-          </w:p>
-        </w:tc>
-        <w:tc>
-          <w:tcPr>
-            <w:tcW w:type="dxa" w:w="4412"/>
+              <w:t xml:space="preserve">test_verification</w:t>
+            </w:r>
+          </w:p>
+        </w:tc>
+        <w:tc>
+          <w:tcPr>
+            <w:tcW w:type="dxa" w:w="4831"/>
           </w:tcPr>
           <w:p>
             <w:pPr>
@@ -11241,13 +12082,13 @@
               <w:rPr>
                 <w:sz w:val="20"/>
               </w:rPr>
-              <w:t xml:space="preserve">RSA keys, numbers and text</w:t>
-            </w:r>
-          </w:p>
-        </w:tc>
-        <w:tc>
-          <w:tcPr>
-            <w:tcW w:type="dxa" w:w="1586"/>
+              <w:t xml:space="preserve">Verification of key, decryption and graph</w:t>
+            </w:r>
+          </w:p>
+        </w:tc>
+        <w:tc>
+          <w:tcPr>
+            <w:tcW w:type="dxa" w:w="1442"/>
           </w:tcPr>
           <w:p>
             <w:pPr>
@@ -11260,7 +12101,7 @@
               <w:rPr>
                 <w:sz w:val="20"/>
               </w:rPr>
-              <w:t xml:space="preserve">109 of 109</w:t>
+              <w:t xml:space="preserve">32 of 32</w:t>
             </w:r>
           </w:p>
         </w:tc>
@@ -11271,7 +12112,7 @@
         </w:trPr>
         <w:tc>
           <w:tcPr>
-            <w:tcW w:type="dxa" w:w="3028"/>
+            <w:tcW w:type="dxa" w:w="2753"/>
           </w:tcPr>
           <w:p>
             <w:pPr>
@@ -11285,13 +12126,13 @@
                 <w:rStyle w:val="VerbatimChar"/>
                 <w:sz w:val="18"/>
               </w:rPr>
-              <w:t xml:space="preserve">test_rsa_users</w:t>
-            </w:r>
-          </w:p>
-        </w:tc>
-        <w:tc>
-          <w:tcPr>
-            <w:tcW w:type="dxa" w:w="4412"/>
+              <w:t xml:space="preserve">test_rsa</w:t>
+            </w:r>
+          </w:p>
+        </w:tc>
+        <w:tc>
+          <w:tcPr>
+            <w:tcW w:type="dxa" w:w="4831"/>
           </w:tcPr>
           <w:p>
             <w:pPr>
@@ -11304,13 +12145,13 @@
               <w:rPr>
                 <w:sz w:val="20"/>
               </w:rPr>
-              <w:t xml:space="preserve">RSA users, key transport, eavesdroppers</w:t>
-            </w:r>
-          </w:p>
-        </w:tc>
-        <w:tc>
-          <w:tcPr>
-            <w:tcW w:type="dxa" w:w="1586"/>
+              <w:t xml:space="preserve">RSA keys, numbers and text</w:t>
+            </w:r>
+          </w:p>
+        </w:tc>
+        <w:tc>
+          <w:tcPr>
+            <w:tcW w:type="dxa" w:w="1442"/>
           </w:tcPr>
           <w:p>
             <w:pPr>
@@ -11323,7 +12164,7 @@
               <w:rPr>
                 <w:sz w:val="20"/>
               </w:rPr>
-              <w:t xml:space="preserve">188 of 188</w:t>
+              <w:t xml:space="preserve">109 of 109</w:t>
             </w:r>
           </w:p>
         </w:tc>
@@ -11334,7 +12175,7 @@
         </w:trPr>
         <w:tc>
           <w:tcPr>
-            <w:tcW w:type="dxa" w:w="3028"/>
+            <w:tcW w:type="dxa" w:w="2753"/>
           </w:tcPr>
           <w:p>
             <w:pPr>
@@ -11348,13 +12189,13 @@
                 <w:rStyle w:val="VerbatimChar"/>
                 <w:sz w:val="18"/>
               </w:rPr>
-              <w:t xml:space="preserve">test_rsa_verification</w:t>
-            </w:r>
-          </w:p>
-        </w:tc>
-        <w:tc>
-          <w:tcPr>
-            <w:tcW w:type="dxa" w:w="4412"/>
+              <w:t xml:space="preserve">test_rsa_users</w:t>
+            </w:r>
+          </w:p>
+        </w:tc>
+        <w:tc>
+          <w:tcPr>
+            <w:tcW w:type="dxa" w:w="4831"/>
           </w:tcPr>
           <w:p>
             <w:pPr>
@@ -11367,13 +12208,13 @@
               <w:rPr>
                 <w:sz w:val="20"/>
               </w:rPr>
-              <w:t xml:space="preserve">Verification of RSA</w:t>
-            </w:r>
-          </w:p>
-        </w:tc>
-        <w:tc>
-          <w:tcPr>
-            <w:tcW w:type="dxa" w:w="1586"/>
+              <w:t xml:space="preserve">RSA users, key transport, eavesdroppers</w:t>
+            </w:r>
+          </w:p>
+        </w:tc>
+        <w:tc>
+          <w:tcPr>
+            <w:tcW w:type="dxa" w:w="1442"/>
           </w:tcPr>
           <w:p>
             <w:pPr>
@@ -11386,7 +12227,7 @@
               <w:rPr>
                 <w:sz w:val="20"/>
               </w:rPr>
-              <w:t xml:space="preserve">27 of 27</w:t>
+              <w:t xml:space="preserve">188 of 188</w:t>
             </w:r>
           </w:p>
         </w:tc>
@@ -11397,7 +12238,7 @@
         </w:trPr>
         <w:tc>
           <w:tcPr>
-            <w:tcW w:type="dxa" w:w="3028"/>
+            <w:tcW w:type="dxa" w:w="2753"/>
           </w:tcPr>
           <w:p>
             <w:pPr>
@@ -11411,13 +12252,13 @@
                 <w:rStyle w:val="VerbatimChar"/>
                 <w:sz w:val="18"/>
               </w:rPr>
-              <w:t xml:space="preserve">test_main_demo</w:t>
-            </w:r>
-          </w:p>
-        </w:tc>
-        <w:tc>
-          <w:tcPr>
-            <w:tcW w:type="dxa" w:w="4412"/>
+              <w:t xml:space="preserve">test_rsa_verification</w:t>
+            </w:r>
+          </w:p>
+        </w:tc>
+        <w:tc>
+          <w:tcPr>
+            <w:tcW w:type="dxa" w:w="4831"/>
           </w:tcPr>
           <w:p>
             <w:pPr>
@@ -11430,13 +12271,13 @@
               <w:rPr>
                 <w:sz w:val="20"/>
               </w:rPr>
-              <w:t xml:space="preserve">The typed demo (without the keyboard)</w:t>
-            </w:r>
-          </w:p>
-        </w:tc>
-        <w:tc>
-          <w:tcPr>
-            <w:tcW w:type="dxa" w:w="1586"/>
+              <w:t xml:space="preserve">Verification of RSA</w:t>
+            </w:r>
+          </w:p>
+        </w:tc>
+        <w:tc>
+          <w:tcPr>
+            <w:tcW w:type="dxa" w:w="1442"/>
           </w:tcPr>
           <w:p>
             <w:pPr>
@@ -11449,7 +12290,7 @@
               <w:rPr>
                 <w:sz w:val="20"/>
               </w:rPr>
-              <w:t xml:space="preserve">59 of 59</w:t>
+              <w:t xml:space="preserve">27 of 27</w:t>
             </w:r>
           </w:p>
         </w:tc>
@@ -11460,7 +12301,70 @@
         </w:trPr>
         <w:tc>
           <w:tcPr>
-            <w:tcW w:type="dxa" w:w="3028"/>
+            <w:tcW w:type="dxa" w:w="2753"/>
+          </w:tcPr>
+          <w:p>
+            <w:pPr>
+              <w:pStyle w:val="Compact"/>
+              <w:keepNext/>
+              <w:spacing w:after="20" w:line="240" w:lineRule="auto"/>
+              <w:jc w:val="left"/>
+            </w:pPr>
+            <w:r>
+              <w:rPr>
+                <w:rStyle w:val="VerbatimChar"/>
+                <w:sz w:val="18"/>
+              </w:rPr>
+              <w:t xml:space="preserve">test_main_demo</w:t>
+            </w:r>
+          </w:p>
+        </w:tc>
+        <w:tc>
+          <w:tcPr>
+            <w:tcW w:type="dxa" w:w="4831"/>
+          </w:tcPr>
+          <w:p>
+            <w:pPr>
+              <w:pStyle w:val="Compact"/>
+              <w:keepNext/>
+              <w:spacing w:after="20" w:line="240" w:lineRule="auto"/>
+              <w:jc w:val="left"/>
+            </w:pPr>
+            <w:r>
+              <w:rPr>
+                <w:sz w:val="20"/>
+              </w:rPr>
+              <w:t xml:space="preserve">The typed demo (without the keyboard)</w:t>
+            </w:r>
+          </w:p>
+        </w:tc>
+        <w:tc>
+          <w:tcPr>
+            <w:tcW w:type="dxa" w:w="1442"/>
+          </w:tcPr>
+          <w:p>
+            <w:pPr>
+              <w:pStyle w:val="Compact"/>
+              <w:keepNext/>
+              <w:spacing w:after="20" w:line="240" w:lineRule="auto"/>
+              <w:jc w:val="center"/>
+            </w:pPr>
+            <w:r>
+              <w:rPr>
+                <w:sz w:val="20"/>
+              </w:rPr>
+              <w:t xml:space="preserve">59 of 59</w:t>
+            </w:r>
+          </w:p>
+        </w:tc>
+      </w:tr>
+      <w:tr>
+        <w:trPr>
+          <w:cantSplit/>
+        </w:trPr>
+        <w:tc>
+          <w:tcPr>
+            <w:tcW w:type="dxa" w:w="2753"/>
           </w:tcPr>
           <w:p>
             <w:pPr>
@@ -11480,18 +12384,18 @@
         </w:tc>
         <w:tc>
           <w:tcPr>
-            <w:tcW w:type="dxa" w:w="4412"/>
-          </w:tcPr>
-          <w:p>
-            <w:pPr>
-              <w:pStyle w:val="Compact"/>
-              <w:spacing w:after="20" w:line="240" w:lineRule="auto"/>
-            </w:pPr>
-          </w:p>
-        </w:tc>
-        <w:tc>
-          <w:tcPr>
-            <w:tcW w:type="dxa" w:w="1586"/>
+            <w:tcW w:type="dxa" w:w="4831"/>
+          </w:tcPr>
+          <w:p>
+            <w:pPr>
+              <w:pStyle w:val="Compact"/>
+              <w:spacing w:after="20" w:line="240" w:lineRule="auto"/>
+            </w:pPr>
+          </w:p>
+        </w:tc>
+        <w:tc>
+          <w:tcPr>
+            <w:tcW w:type="dxa" w:w="1442"/>
           </w:tcPr>
           <w:p>
             <w:pPr>
@@ -11505,7 +12409,7 @@
                 <w:b/>
                 <w:sz w:val="20"/>
               </w:rPr>
-              <w:t xml:space="preserve">1,094 of 1,094</w:t>
+              <w:t xml:space="preserve">1,196 of 1,196</w:t>
             </w:r>
           </w:p>
         </w:tc>
@@ -11517,7 +12421,7 @@
         <w:spacing w:before="200"/>
       </w:pPr>
       <w:r>
-        <w:t xml:space="preserve">Three more test files (</w:t>
+        <w:t xml:space="preserve">Four more test files (</w:t>
       </w:r>
       <w:r>
         <w:rPr>
@@ -11538,6 +12442,18 @@
         <w:t xml:space="preserve">test_graph_pictures</w:t>
       </w:r>
       <w:r>
+        <w:t xml:space="preserve">,</w:t>
+      </w:r>
+      <w:r>
+        <w:t xml:space="preserve"> </w:t>
+      </w:r>
+      <w:r>
+        <w:rPr>
+          <w:rStyle w:val="VerbatimChar"/>
+        </w:rPr>
+        <w:t xml:space="preserve">test_digraph_pictures</w:t>
+      </w:r>
+      <w:r>
         <w:t xml:space="preserve"> </w:t>
       </w:r>
       <w:r>
@@ -11553,7 +12469,22 @@
         <w:t xml:space="preserve">test_route_picture</w:t>
       </w:r>
       <w:r>
-        <w:t xml:space="preserve">) draw figures and are run in MATLAB by the team. The tests never write into the</w:t>
+        <w:t xml:space="preserve">) draw figures and are run in MATLAB by the team.</w:t>
+      </w:r>
+      <w:r>
+        <w:t xml:space="preserve"> </w:t>
+      </w:r>
+      <w:r>
+        <w:rPr>
+          <w:rStyle w:val="VerbatimChar"/>
+        </w:rPr>
+        <w:t xml:space="preserve">test_digraph_pictures</w:t>
+      </w:r>
+      <w:r>
+        <w:t xml:space="preserve"> </w:t>
+      </w:r>
+      <w:r>
+        <w:t xml:space="preserve">(26 checks) was also run once in GNU Octave with the gnuplot graphics toolkit, where all 26 passed; this is not a MATLAB run. The tests never write into the</w:t>
       </w:r>
       <w:r>
         <w:t xml:space="preserve"> </w:t>
@@ -17207,7 +18138,7 @@
       </w:tr>
     </w:tbl>
     <w:bookmarkEnd w:id="65"/>
-    <w:bookmarkStart w:id="84" w:name="figures-of-the-network"/>
+    <w:bookmarkStart w:id="66" w:name="the-directed-graph"/>
     <w:p>
       <w:pPr>
         <w:pStyle w:val="Heading2"/>
@@ -17222,7 +18153,7 @@
         <w:tab/>
       </w:r>
       <w:r>
-        <w:t xml:space="preserve">Figures of the network</w:t>
+        <w:t xml:space="preserve">The directed graph</w:t>
       </w:r>
     </w:p>
     <w:p>
@@ -17230,22 +18161,16 @@
         <w:pStyle w:val="FirstParagraph"/>
       </w:pPr>
       <w:r>
-        <w:t xml:space="preserve">Six pictures show the network of the six users. Figures 6 to 10 are made by</w:t>
-      </w:r>
-      <w:r>
-        <w:t xml:space="preserve"> </w:t>
+        <w:t xml:space="preserve">The directed version of the network (</w:t>
       </w:r>
       <w:r>
         <w:rPr>
           <w:rStyle w:val="VerbatimChar"/>
         </w:rPr>
-        <w:t xml:space="preserve">demo_point2</w:t>
-      </w:r>
-      <w:r>
-        <w:t xml:space="preserve"> </w:t>
-      </w:r>
-      <w:r>
-        <w:t xml:space="preserve">and Figure 11 by option 7 of</w:t>
+        <w:t xml:space="preserve">demo_point2d</w:t>
+      </w:r>
+      <w:r>
+        <w:t xml:space="preserve">,</w:t>
       </w:r>
       <w:r>
         <w:t xml:space="preserve"> </w:t>
@@ -17254,25 +18179,21 @@
         <w:rPr>
           <w:rStyle w:val="VerbatimChar"/>
         </w:rPr>
-        <w:t xml:space="preserve">main_demo</w:t>
-      </w:r>
-      <w:r>
-        <w:t xml:space="preserve">. In every picture the users keep the places that</w:t>
-      </w:r>
-      <w:r>
-        <w:t xml:space="preserve"> </w:t>
-      </w:r>
-      <w:r>
-        <w:rPr>
-          <w:rStyle w:val="VerbatimChar"/>
-        </w:rPr>
-        <w:t xml:space="preserve">graph_layout</w:t>
-      </w:r>
-      <w:r>
-        <w:t xml:space="preserve"> </w:t>
-      </w:r>
-      <w:r>
-        <w:t xml:space="preserve">gives for the whole network, so only the colors, the line widths, the line styles and the title change from one picture to the next. The channels are numbered e1 to e6 in the order Alice–Bob, Alice–Carol, Bob–Dave, Carol–Dave, Dave–Frank and Frank–Grace.</w:t>
+        <w:t xml:space="preserve">show_digraph</w:t>
+      </w:r>
+      <w:r>
+        <w:t xml:space="preserve">) has the same six channels as</w:t>
+      </w:r>
+      <w:r>
+        <w:t xml:space="preserve"> </w:t>
+      </w:r>
+      <m:oMath>
+        <m:r>
+          <m:t>G</m:t>
+        </m:r>
+      </m:oMath>
+      <w:r>
+        <w:t xml:space="preserve">. Two of them work both ways (Alice – Bob and Dave – Frank) and four work one way only, so the digraph has 8 arcs: Alice → Bob, Bob → Alice, Bob → Dave, Carol → Alice, Dave → Carol, Dave → Frank, Frank → Dave and Frank → Grace. The adjacency matrix is not symmetric. The out-degrees of Alice, Bob, Carol, Dave, Frank and Grace are 1, 2, 1, 2, 2 and 0, the in-degrees are 2, 1, 1, 2, 1 and 1, and both sums are 8, the number of arcs.</w:t>
       </w:r>
     </w:p>
     <w:p>
@@ -17280,6 +18201,115 @@
         <w:pStyle w:val="BodyText"/>
       </w:pPr>
       <w:r>
+        <w:t xml:space="preserve">The directions change the distances. From Alice to Carol the shortest directed path is Alice → Bob → Dave → Carol (3 arcs), while from Carol to Alice it is the single arc Carol → Alice (1 arc), so the distance table is not symmetric. From Alice to Grace the path is Alice → Bob → Dave → Frank → Grace (4 arcs), but Grace has no arc leaving her, so there is no path from Grace to anybody else. Alice, Bob, Carol, Dave and Frank can reach all six users, and Grace can reach only herself.</w:t>
+      </w:r>
+    </w:p>
+    <w:p>
+      <w:pPr>
+        <w:pStyle w:val="BodyText"/>
+      </w:pPr>
+      <w:r>
+        <w:t xml:space="preserve">Therefore the digraph has two strongly connected components, {Alice, Bob, Carol, Dave, Frank} and {Grace}, and one weakly connected component (the same single group as the undirected graph). The directed cycle Alice → Bob → Dave → Carol → Alice keeps the first five users together.</w:t>
+      </w:r>
+      <w:r>
+        <w:t xml:space="preserve"> </w:t>
+      </w:r>
+      <w:r>
+        <w:rPr>
+          <w:rStyle w:val="VerbatimChar"/>
+        </w:rPr>
+        <w:t xml:space="preserve">show_digraph</w:t>
+      </w:r>
+      <w:r>
+        <w:t xml:space="preserve"> </w:t>
+      </w:r>
+      <w:r>
+        <w:t xml:space="preserve">ends with eight checks, and all of them say yes in the Octave run. One of them compares the reachable users found by breadth-first search with those found by Warshall’s algorithm, and another compares the strong components with the groups found from the Warshall matrix. The tests also check the numbers above, the refusal of bad arc lists, a digraph with all channels two-way (strongly connected, symmetric matrix) and a digraph with only one-way channels (six components of one user each).</w:t>
+      </w:r>
+    </w:p>
+    <w:bookmarkEnd w:id="66"/>
+    <w:bookmarkStart w:id="94" w:name="figures-of-the-network"/>
+    <w:p>
+      <w:pPr>
+        <w:pStyle w:val="Heading2"/>
+      </w:pPr>
+      <w:r>
+        <w:rPr>
+          <w:rStyle w:val="SectionNumber"/>
+        </w:rPr>
+        <w:t xml:space="preserve">5.8</w:t>
+      </w:r>
+      <w:r>
+        <w:tab/>
+      </w:r>
+      <w:r>
+        <w:t xml:space="preserve">Figures of the network</w:t>
+      </w:r>
+    </w:p>
+    <w:p>
+      <w:pPr>
+        <w:pStyle w:val="FirstParagraph"/>
+      </w:pPr>
+      <w:r>
+        <w:t xml:space="preserve">Eight pictures show the network of the six users. Figures 6 to 10 are made by</w:t>
+      </w:r>
+      <w:r>
+        <w:t xml:space="preserve"> </w:t>
+      </w:r>
+      <w:r>
+        <w:rPr>
+          <w:rStyle w:val="VerbatimChar"/>
+        </w:rPr>
+        <w:t xml:space="preserve">demo_point2</w:t>
+      </w:r>
+      <w:r>
+        <w:t xml:space="preserve">, Figure 11 by option 7 of</w:t>
+      </w:r>
+      <w:r>
+        <w:t xml:space="preserve"> </w:t>
+      </w:r>
+      <w:r>
+        <w:rPr>
+          <w:rStyle w:val="VerbatimChar"/>
+        </w:rPr>
+        <w:t xml:space="preserve">main_demo</w:t>
+      </w:r>
+      <w:r>
+        <w:t xml:space="preserve">, and Figures 12 to 14 (the directed graph) by</w:t>
+      </w:r>
+      <w:r>
+        <w:t xml:space="preserve"> </w:t>
+      </w:r>
+      <w:r>
+        <w:rPr>
+          <w:rStyle w:val="VerbatimChar"/>
+        </w:rPr>
+        <w:t xml:space="preserve">demo_point2d</w:t>
+      </w:r>
+      <w:r>
+        <w:t xml:space="preserve">. In every picture the users keep the places that</w:t>
+      </w:r>
+      <w:r>
+        <w:t xml:space="preserve"> </w:t>
+      </w:r>
+      <w:r>
+        <w:rPr>
+          <w:rStyle w:val="VerbatimChar"/>
+        </w:rPr>
+        <w:t xml:space="preserve">graph_layout</w:t>
+      </w:r>
+      <w:r>
+        <w:t xml:space="preserve"> </w:t>
+      </w:r>
+      <w:r>
+        <w:t xml:space="preserve">gives for the whole network, so only the colors, the line widths, the line styles and the title change from one picture to the next. The channels are numbered e1 to e6 in the order Alice–Bob, Alice–Carol, Bob–Dave, Carol–Dave, Dave–Frank and Frank–Grace.</w:t>
+      </w:r>
+    </w:p>
+    <w:p>
+      <w:pPr>
+        <w:pStyle w:val="BodyText"/>
+      </w:pPr>
+      <w:r>
         <w:rPr>
           <w:iCs/>
           <w:i/>
@@ -17290,7 +18320,37 @@
         <w:t xml:space="preserve"> </w:t>
       </w:r>
       <w:r>
-        <w:t xml:space="preserve">The six pictures in this version of the report were not copied from MATLAB windows. A separate plotting script (</w:t>
+        <w:t xml:space="preserve">Figures 12 to 14 are the PNG files that the project function</w:t>
+      </w:r>
+      <w:r>
+        <w:t xml:space="preserve"> </w:t>
+      </w:r>
+      <w:r>
+        <w:rPr>
+          <w:rStyle w:val="VerbatimChar"/>
+        </w:rPr>
+        <w:t xml:space="preserve">save_digraph_pictures</w:t>
+      </w:r>
+      <w:r>
+        <w:t xml:space="preserve"> </w:t>
+      </w:r>
+      <w:r>
+        <w:t xml:space="preserve">wrote when it was run in GNU Octave with the gnuplot graphics toolkit; they are drawn by the real drawing code but not by MATLAB, and they will be replaced by the PNG files of</w:t>
+      </w:r>
+      <w:r>
+        <w:t xml:space="preserve"> </w:t>
+      </w:r>
+      <w:r>
+        <w:rPr>
+          <w:rStyle w:val="VerbatimChar"/>
+        </w:rPr>
+        <w:t xml:space="preserve">demo_point2d</w:t>
+      </w:r>
+      <w:r>
+        <w:t xml:space="preserve"> </w:t>
+      </w:r>
+      <w:r>
+        <w:t xml:space="preserve">after the run on the demo laptop. The six other pictures in this version of the report were not copied from MATLAB windows. A separate plotting script (</w:t>
       </w:r>
       <w:r>
         <w:rPr>
@@ -17395,18 +18455,18 @@
           <wp:inline>
             <wp:extent cx="5039999" cy="1867596"/>
             <wp:effectExtent b="0" l="0" r="0" t="0"/>
-            <wp:docPr descr="Figure 6. The communication network: the users are the vertices and the six channels are the edges (point2_network.png)." title="" id="67" name="Picture"/>
+            <wp:docPr descr="Figure 6. The communication network: the users are the vertices and the six channels are the edges (point2_network.png)." title="" id="68" name="Picture"/>
             <a:graphic>
               <a:graphicData uri="http://schemas.openxmlformats.org/drawingml/2006/picture">
                 <pic:pic>
                   <pic:nvPicPr>
-                    <pic:cNvPr descr="docs/report_figures/point2_network.png" id="68" name="Picture"/>
+                    <pic:cNvPr descr="docs/report_figures/point2_network.png" id="69" name="Picture"/>
                     <pic:cNvPicPr>
                       <a:picLocks noChangeArrowheads="1" noChangeAspect="1"/>
                     </pic:cNvPicPr>
                   </pic:nvPicPr>
                   <pic:blipFill>
-                    <a:blip r:embed="rId66"/>
+                    <a:blip r:embed="rId67"/>
                     <a:stretch>
                       <a:fillRect/>
                     </a:stretch>
@@ -17459,18 +18519,18 @@
           <wp:inline>
             <wp:extent cx="5039999" cy="1867596"/>
             <wp:effectExtent b="0" l="0" r="0" t="0"/>
-            <wp:docPr descr="Figure 7. The shortest path from Alice to Grace: Alice – Bob – Dave – Frank – Grace, 4 channels (point2_shortest_path.png)." title="" id="70" name="Picture"/>
+            <wp:docPr descr="Figure 7. The shortest path from Alice to Grace: Alice – Bob – Dave – Frank – Grace, 4 channels (point2_shortest_path.png)." title="" id="71" name="Picture"/>
             <a:graphic>
               <a:graphicData uri="http://schemas.openxmlformats.org/drawingml/2006/picture">
                 <pic:pic>
                   <pic:nvPicPr>
-                    <pic:cNvPr descr="docs/report_figures/point2_shortest_path.png" id="71" name="Picture"/>
+                    <pic:cNvPr descr="docs/report_figures/point2_shortest_path.png" id="72" name="Picture"/>
                     <pic:cNvPicPr>
                       <a:picLocks noChangeArrowheads="1" noChangeAspect="1"/>
                     </pic:cNvPicPr>
                   </pic:nvPicPr>
                   <pic:blipFill>
-                    <a:blip r:embed="rId69"/>
+                    <a:blip r:embed="rId70"/>
                     <a:stretch>
                       <a:fillRect/>
                     </a:stretch>
@@ -17523,18 +18583,18 @@
           <wp:inline>
             <wp:extent cx="5039999" cy="1867596"/>
             <wp:effectExtent b="0" l="0" r="0" t="0"/>
-            <wp:docPr descr="Figure 8. A shortest cycle: Alice – Bob – Dave – Carol – Alice, length 4. The network has exactly one independent cycle, since 6 channels − 6 users + 1 group = 1 (point2_cycle.png)." title="" id="73" name="Picture"/>
+            <wp:docPr descr="Figure 8. A shortest cycle: Alice – Bob – Dave – Carol – Alice, length 4. The network has exactly one independent cycle, since 6 channels − 6 users + 1 group = 1 (point2_cycle.png)." title="" id="74" name="Picture"/>
             <a:graphic>
               <a:graphicData uri="http://schemas.openxmlformats.org/drawingml/2006/picture">
                 <pic:pic>
                   <pic:nvPicPr>
-                    <pic:cNvPr descr="docs/report_figures/point2_cycle.png" id="74" name="Picture"/>
+                    <pic:cNvPr descr="docs/report_figures/point2_cycle.png" id="75" name="Picture"/>
                     <pic:cNvPicPr>
                       <a:picLocks noChangeArrowheads="1" noChangeAspect="1"/>
                     </pic:cNvPicPr>
                   </pic:nvPicPr>
                   <pic:blipFill>
-                    <a:blip r:embed="rId72"/>
+                    <a:blip r:embed="rId73"/>
                     <a:stretch>
                       <a:fillRect/>
                     </a:stretch>
@@ -17587,18 +18647,18 @@
           <wp:inline>
             <wp:extent cx="5039999" cy="1867596"/>
             <wp:effectExtent b="0" l="0" r="0" t="0"/>
-            <wp:docPr descr="Figure 9. The weak points: the bridge channels Dave – Frank (e5) and Frank – Grace (e6) are red, and the cut users Dave and Frank are orange (point2_weak_points.png)." title="" id="76" name="Picture"/>
+            <wp:docPr descr="Figure 9. The weak points: the bridge channels Dave – Frank (e5) and Frank – Grace (e6) are red, and the cut users Dave and Frank are orange (point2_weak_points.png)." title="" id="77" name="Picture"/>
             <a:graphic>
               <a:graphicData uri="http://schemas.openxmlformats.org/drawingml/2006/picture">
                 <pic:pic>
                   <pic:nvPicPr>
-                    <pic:cNvPr descr="docs/report_figures/point2_weak_points.png" id="77" name="Picture"/>
+                    <pic:cNvPr descr="docs/report_figures/point2_weak_points.png" id="78" name="Picture"/>
                     <pic:cNvPicPr>
                       <a:picLocks noChangeArrowheads="1" noChangeAspect="1"/>
                     </pic:cNvPicPr>
                   </pic:nvPicPr>
                   <pic:blipFill>
-                    <a:blip r:embed="rId75"/>
+                    <a:blip r:embed="rId76"/>
                     <a:stretch>
                       <a:fillRect/>
                     </a:stretch>
@@ -17651,18 +18711,18 @@
           <wp:inline>
             <wp:extent cx="5039999" cy="1867596"/>
             <wp:effectExtent b="0" l="0" r="0" t="0"/>
-            <wp:docPr descr="Figure 10. The network after the bridge channel Dave – Frank is removed (dotted): two groups of users, {Alice, Bob, Carol, Dave} and {Frank, Grace}, one color each (point2_split.png)." title="" id="79" name="Picture"/>
+            <wp:docPr descr="Figure 10. The network after the bridge channel Dave – Frank is removed (dotted): two groups of users, {Alice, Bob, Carol, Dave} and {Frank, Grace}, one color each (point2_split.png)." title="" id="80" name="Picture"/>
             <a:graphic>
               <a:graphicData uri="http://schemas.openxmlformats.org/drawingml/2006/picture">
                 <pic:pic>
                   <pic:nvPicPr>
-                    <pic:cNvPr descr="docs/report_figures/point2_split.png" id="80" name="Picture"/>
+                    <pic:cNvPr descr="docs/report_figures/point2_split.png" id="81" name="Picture"/>
                     <pic:cNvPicPr>
                       <a:picLocks noChangeArrowheads="1" noChangeAspect="1"/>
                     </pic:cNvPicPr>
                   </pic:nvPicPr>
                   <pic:blipFill>
-                    <a:blip r:embed="rId78"/>
+                    <a:blip r:embed="rId79"/>
                     <a:stretch>
                       <a:fillRect/>
                     </a:stretch>
@@ -17715,18 +18775,18 @@
           <wp:inline>
             <wp:extent cx="5039999" cy="1867596"/>
             <wp:effectExtent b="0" l="0" r="0" t="0"/>
-            <wp:docPr descr="Figure 11. The route of the message from Alice to Grace in main_demo (option 7). The thick green channels e1, e3, e5 and e6 carry it with the keys 85, 42, 32 and 72; Alice and Grace are dark green, Bob, Dave and Frank light green, and Carol is not on the route (point5_route.png)." title="" id="82" name="Picture"/>
+            <wp:docPr descr="Figure 11. The route of the message from Alice to Grace in main_demo (option 7). The thick green channels e1, e3, e5 and e6 carry it with the keys 85, 42, 32 and 72; Alice and Grace are dark green, Bob, Dave and Frank light green, and Carol is not on the route (point5_route.png)." title="" id="83" name="Picture"/>
             <a:graphic>
               <a:graphicData uri="http://schemas.openxmlformats.org/drawingml/2006/picture">
                 <pic:pic>
                   <pic:nvPicPr>
-                    <pic:cNvPr descr="docs/report_figures/point5_route.png" id="83" name="Picture"/>
+                    <pic:cNvPr descr="docs/report_figures/point5_route.png" id="84" name="Picture"/>
                     <pic:cNvPicPr>
                       <a:picLocks noChangeArrowheads="1" noChangeAspect="1"/>
                     </pic:cNvPicPr>
                   </pic:nvPicPr>
                   <pic:blipFill>
-                    <a:blip r:embed="rId81"/>
+                    <a:blip r:embed="rId82"/>
                     <a:stretch>
                       <a:fillRect/>
                     </a:stretch>
@@ -17785,9 +18845,201 @@
         <w:t xml:space="preserve">).</w:t>
       </w:r>
     </w:p>
-    <w:bookmarkEnd w:id="84"/>
-    <w:bookmarkEnd w:id="85"/>
-    <w:bookmarkStart w:id="86" w:name="security-analysis-and-limitations"/>
+    <w:p>
+      <w:pPr>
+        <w:pStyle w:val="CaptionedFigure"/>
+      </w:pPr>
+      <w:r>
+        <w:drawing>
+          <wp:inline>
+            <wp:extent cx="5039999" cy="1870847"/>
+            <wp:effectExtent b="0" l="0" r="0" t="0"/>
+            <wp:docPr descr="Figure 12. The directed network: the 8 arcs a1 to a8 are arrows. The two arrows of a two-way channel run side by side (gray), and the one-way channels are blue (point2d_digraph.png)." title="" id="86" name="Picture"/>
+            <a:graphic>
+              <a:graphicData uri="http://schemas.openxmlformats.org/drawingml/2006/picture">
+                <pic:pic>
+                  <pic:nvPicPr>
+                    <pic:cNvPr descr="docs/report_figures/point2d_digraph.png" id="87" name="Picture"/>
+                    <pic:cNvPicPr>
+                      <a:picLocks noChangeArrowheads="1" noChangeAspect="1"/>
+                    </pic:cNvPicPr>
+                  </pic:nvPicPr>
+                  <pic:blipFill>
+                    <a:blip r:embed="rId85"/>
+                    <a:stretch>
+                      <a:fillRect/>
+                    </a:stretch>
+                  </pic:blipFill>
+                  <pic:spPr bwMode="auto">
+                    <a:xfrm>
+                      <a:off x="0" y="0"/>
+                      <a:ext cx="5039999" cy="1870847"/>
+                    </a:xfrm>
+                    <a:prstGeom prst="rect">
+                      <a:avLst/>
+                    </a:prstGeom>
+                    <a:noFill/>
+                    <a:ln w="9525">
+                      <a:noFill/>
+                      <a:headEnd/>
+                      <a:tailEnd/>
+                    </a:ln>
+                  </pic:spPr>
+                </pic:pic>
+              </a:graphicData>
+            </a:graphic>
+          </wp:inline>
+        </w:drawing>
+      </w:r>
+    </w:p>
+    <w:p>
+      <w:pPr>
+        <w:pStyle w:val="ImageCaption"/>
+      </w:pPr>
+      <w:r>
+        <w:t xml:space="preserve">Figure 12. The directed network: the 8 arcs a1 to a8 are arrows. The two arrows of a two-way channel run side by side (gray), and the one-way channels are blue (</w:t>
+      </w:r>
+      <w:r>
+        <w:rPr>
+          <w:rStyle w:val="VerbatimChar"/>
+        </w:rPr>
+        <w:t xml:space="preserve">point2d_digraph.png</w:t>
+      </w:r>
+      <w:r>
+        <w:t xml:space="preserve">).</w:t>
+      </w:r>
+    </w:p>
+    <w:p>
+      <w:pPr>
+        <w:pStyle w:val="CaptionedFigure"/>
+      </w:pPr>
+      <w:r>
+        <w:drawing>
+          <wp:inline>
+            <wp:extent cx="5039999" cy="1870847"/>
+            <wp:effectExtent b="0" l="0" r="0" t="0"/>
+            <wp:docPr descr="Figure 13. The shortest directed path from Alice to Grace, 4 arcs (green). There is no path back from Grace to Alice (point2d_path.png)." title="" id="89" name="Picture"/>
+            <a:graphic>
+              <a:graphicData uri="http://schemas.openxmlformats.org/drawingml/2006/picture">
+                <pic:pic>
+                  <pic:nvPicPr>
+                    <pic:cNvPr descr="docs/report_figures/point2d_path.png" id="90" name="Picture"/>
+                    <pic:cNvPicPr>
+                      <a:picLocks noChangeArrowheads="1" noChangeAspect="1"/>
+                    </pic:cNvPicPr>
+                  </pic:nvPicPr>
+                  <pic:blipFill>
+                    <a:blip r:embed="rId88"/>
+                    <a:stretch>
+                      <a:fillRect/>
+                    </a:stretch>
+                  </pic:blipFill>
+                  <pic:spPr bwMode="auto">
+                    <a:xfrm>
+                      <a:off x="0" y="0"/>
+                      <a:ext cx="5039999" cy="1870847"/>
+                    </a:xfrm>
+                    <a:prstGeom prst="rect">
+                      <a:avLst/>
+                    </a:prstGeom>
+                    <a:noFill/>
+                    <a:ln w="9525">
+                      <a:noFill/>
+                      <a:headEnd/>
+                      <a:tailEnd/>
+                    </a:ln>
+                  </pic:spPr>
+                </pic:pic>
+              </a:graphicData>
+            </a:graphic>
+          </wp:inline>
+        </w:drawing>
+      </w:r>
+    </w:p>
+    <w:p>
+      <w:pPr>
+        <w:pStyle w:val="ImageCaption"/>
+      </w:pPr>
+      <w:r>
+        <w:t xml:space="preserve">Figure 13. The shortest directed path from Alice to Grace, 4 arcs (green). There is no path back from Grace to Alice (</w:t>
+      </w:r>
+      <w:r>
+        <w:rPr>
+          <w:rStyle w:val="VerbatimChar"/>
+        </w:rPr>
+        <w:t xml:space="preserve">point2d_path.png</w:t>
+      </w:r>
+      <w:r>
+        <w:t xml:space="preserve">).</w:t>
+      </w:r>
+    </w:p>
+    <w:p>
+      <w:pPr>
+        <w:pStyle w:val="CaptionedFigure"/>
+      </w:pPr>
+      <w:r>
+        <w:drawing>
+          <wp:inline>
+            <wp:extent cx="5039999" cy="1870847"/>
+            <wp:effectExtent b="0" l="0" r="0" t="0"/>
+            <wp:docPr descr="Figure 14. The strongly connected components: {Alice, Bob, Carol, Dave, Frank} and {Grace}. The only arc between the two groups, Frank → Grace, is red (point2d_strong.png)." title="" id="92" name="Picture"/>
+            <a:graphic>
+              <a:graphicData uri="http://schemas.openxmlformats.org/drawingml/2006/picture">
+                <pic:pic>
+                  <pic:nvPicPr>
+                    <pic:cNvPr descr="docs/report_figures/point2d_strong.png" id="93" name="Picture"/>
+                    <pic:cNvPicPr>
+                      <a:picLocks noChangeArrowheads="1" noChangeAspect="1"/>
+                    </pic:cNvPicPr>
+                  </pic:nvPicPr>
+                  <pic:blipFill>
+                    <a:blip r:embed="rId91"/>
+                    <a:stretch>
+                      <a:fillRect/>
+                    </a:stretch>
+                  </pic:blipFill>
+                  <pic:spPr bwMode="auto">
+                    <a:xfrm>
+                      <a:off x="0" y="0"/>
+                      <a:ext cx="5039999" cy="1870847"/>
+                    </a:xfrm>
+                    <a:prstGeom prst="rect">
+                      <a:avLst/>
+                    </a:prstGeom>
+                    <a:noFill/>
+                    <a:ln w="9525">
+                      <a:noFill/>
+                      <a:headEnd/>
+                      <a:tailEnd/>
+                    </a:ln>
+                  </pic:spPr>
+                </pic:pic>
+              </a:graphicData>
+            </a:graphic>
+          </wp:inline>
+        </w:drawing>
+      </w:r>
+    </w:p>
+    <w:p>
+      <w:pPr>
+        <w:pStyle w:val="ImageCaption"/>
+      </w:pPr>
+      <w:r>
+        <w:t xml:space="preserve">Figure 14. The strongly connected components: {Alice, Bob, Carol, Dave, Frank} and {Grace}. The only arc between the two groups, Frank → Grace, is red (</w:t>
+      </w:r>
+      <w:r>
+        <w:rPr>
+          <w:rStyle w:val="VerbatimChar"/>
+        </w:rPr>
+        <w:t xml:space="preserve">point2d_strong.png</w:t>
+      </w:r>
+      <w:r>
+        <w:t xml:space="preserve">).</w:t>
+      </w:r>
+    </w:p>
+    <w:bookmarkEnd w:id="94"/>
+    <w:bookmarkEnd w:id="95"/>
+    <w:bookmarkStart w:id="96" w:name="security-analysis-and-limitations"/>
     <w:p>
       <w:pPr>
         <w:pStyle w:val="Heading1"/>
@@ -18874,17 +20126,29 @@
           <w:iCs/>
           <w:i/>
         </w:rPr>
-        <w:t xml:space="preserve">Undirected graph.</w:t>
-      </w:r>
-      <w:r>
-        <w:t xml:space="preserve"> </w:t>
-      </w:r>
-      <w:r>
-        <w:t xml:space="preserve">All channels are two-way (Section 2.2).</w:t>
+        <w:t xml:space="preserve">One example of directions.</w:t>
+      </w:r>
+      <w:r>
+        <w:t xml:space="preserve"> </w:t>
+      </w:r>
+      <w:r>
+        <w:t xml:space="preserve">The digraph uses one fixed choice of directions for the six channels (changeable in</w:t>
+      </w:r>
+      <w:r>
+        <w:t xml:space="preserve"> </w:t>
+      </w:r>
+      <w:r>
+        <w:rPr>
+          <w:rStyle w:val="VerbatimChar"/>
+        </w:rPr>
+        <w:t xml:space="preserve">define_digraph</w:t>
+      </w:r>
+      <w:r>
+        <w:t xml:space="preserve">). The routing of Section 5.4 still uses the undirected graph, because the encrypted channels are two-way; the digraph is analysed and drawn but does not route messages.</w:t>
       </w:r>
     </w:p>
-    <w:bookmarkEnd w:id="86"/>
-    <w:bookmarkStart w:id="87" w:name="conclusion-and-future-work"/>
+    <w:bookmarkEnd w:id="96"/>
+    <w:bookmarkStart w:id="97" w:name="conclusion-and-future-work"/>
     <w:p>
       <w:pPr>
         <w:pStyle w:val="Heading1"/>
@@ -18907,7 +20171,7 @@
         <w:pStyle w:val="FirstParagraph"/>
       </w:pPr>
       <w:r>
-        <w:t xml:space="preserve">The project connects four topics of discrete mathematics in one working program. Sets, relations and functions describe the users and the cipher. Graph theory finds the route of a message and the weak points of the network. Group theory explains why the Diffie–Hellman key is the same on both sides, and why RSA decrypts correctly. Number theory supplies the algorithms that make it fast. The result is a 116-file MATLAB program with 1,094 automatic checks that pass in GNU Octave, and a verification layer that checks the key, the decryption, the graph and RSA a second way. The simulated attackers show that the small numbers give no protection, which is the main lesson of the model.</w:t>
+        <w:t xml:space="preserve">The project connects four topics of discrete mathematics in one working program. Sets, relations and functions describe the users and the cipher. Graph theory finds the route of a message and the weak points of the network. Group theory explains why the Diffie–Hellman key is the same on both sides, and why RSA decrypts correctly. Number theory supplies the algorithms that make it fast. The result is a 128-file MATLAB program with 1,196 automatic checks that pass in GNU Octave, and a verification layer that checks the key, the decryption, the graph and RSA a second way. The simulated attackers show that the small numbers give no protection, which is the main lesson of the model.</w:t>
       </w:r>
     </w:p>
     <w:p>
@@ -18947,11 +20211,11 @@
         </m:sSubSup>
       </m:oMath>
       <w:r>
-        <w:t xml:space="preserve">, and add directed channels to the graph model.</w:t>
+        <w:t xml:space="preserve">, and let the routing follow the directed channels of the digraph.</w:t>
       </w:r>
     </w:p>
-    <w:bookmarkEnd w:id="87"/>
-    <w:bookmarkStart w:id="88" w:name="references"/>
+    <w:bookmarkEnd w:id="97"/>
+    <w:bookmarkStart w:id="98" w:name="references"/>
     <w:p>
       <w:pPr>
         <w:pStyle w:val="Heading1"/>
@@ -19133,8 +20397,8 @@
         <w:t xml:space="preserve">, Addison-Wesley.</w:t>
       </w:r>
     </w:p>
-    <w:bookmarkEnd w:id="88"/>
-    <w:bookmarkStart w:id="89" w:name="appendix-a-how-to-run-the-project"/>
+    <w:bookmarkEnd w:id="98"/>
+    <w:bookmarkStart w:id="99" w:name="appendix-a-how-to-run-the-project"/>
     <w:p>
       <w:pPr>
         <w:pStyle w:val="Heading1"/>
@@ -19266,6 +20530,33 @@
         <w:rPr>
           <w:rStyle w:val="VerbatimChar"/>
         </w:rPr>
+        <w:t xml:space="preserve">demo_point2d</w:t>
+      </w:r>
+      <w:r>
+        <w:t xml:space="preserve"> </w:t>
+      </w:r>
+      <w:r>
+        <w:t xml:space="preserve">(the directed graph and 3 pictures, saved in</w:t>
+      </w:r>
+      <w:r>
+        <w:t xml:space="preserve"> </w:t>
+      </w:r>
+      <w:r>
+        <w:rPr>
+          <w:rStyle w:val="VerbatimChar"/>
+        </w:rPr>
+        <w:t xml:space="preserve">outputs</w:t>
+      </w:r>
+      <w:r>
+        <w:t xml:space="preserve">),</w:t>
+      </w:r>
+      <w:r>
+        <w:t xml:space="preserve"> </w:t>
+      </w:r>
+      <w:r>
+        <w:rPr>
+          <w:rStyle w:val="VerbatimChar"/>
+        </w:rPr>
         <w:t xml:space="preserve">demo_point3</w:t>
       </w:r>
       <w:r>
@@ -19424,8 +20715,8 @@
         <w:t xml:space="preserve">.</w:t>
       </w:r>
     </w:p>
-    <w:bookmarkEnd w:id="89"/>
-    <w:bookmarkStart w:id="90" w:name="appendix-b-the-code-file-by-file"/>
+    <w:bookmarkEnd w:id="99"/>
+    <w:bookmarkStart w:id="100" w:name="appendix-b-the-code-file-by-file"/>
     <w:p>
       <w:pPr>
         <w:pStyle w:val="Heading1"/>
@@ -19489,7 +20780,7 @@
         <w:pStyle w:val="TableCaption"/>
       </w:pPr>
       <w:r>
-        <w:t xml:space="preserve">Table 9. The functions of each module (116 files in</w:t>
+        <w:t xml:space="preserve">Table 9. The functions of each module (128 files in</w:t>
       </w:r>
       <w:r>
         <w:t xml:space="preserve"> </w:t>
@@ -19525,7 +20816,7 @@
           <w:right w:w="80" w:type="dxa"/>
         </w:tblCellMar>
         <w:tblLook w:firstRow="1" w:lastRow="0" w:firstColumn="0" w:lastColumn="0" w:noHBand="0" w:noVBand="0" w:val="0020"/>
-        <w:tblCaption w:val="Table 9. The functions of each module (116 files in src/)."/>
+        <w:tblCaption w:val="Table 9. The functions of each module (128 files in src/)."/>
       </w:tblPr>
       <w:tblGrid>
         <w:gridCol w:w="1799"/>
@@ -19990,7 +21281,7 @@
                 <w:rStyle w:val="VerbatimChar"/>
                 <w:sz w:val="18"/>
               </w:rPr>
-              <w:t xml:space="preserve">adjacency_to_edges</w:t>
+              <w:t xml:space="preserve">adjacency_to_arcs</w:t>
             </w:r>
             <w:r>
               <w:rPr>
@@ -20009,7 +21300,7 @@
                 <w:rStyle w:val="VerbatimChar"/>
                 <w:sz w:val="18"/>
               </w:rPr>
-              <w:t xml:space="preserve">adjacency_to_list</w:t>
+              <w:t xml:space="preserve">adjacency_to_edges</w:t>
             </w:r>
             <w:r>
               <w:rPr>
@@ -20028,7 +21319,7 @@
                 <w:rStyle w:val="VerbatimChar"/>
                 <w:sz w:val="18"/>
               </w:rPr>
-              <w:t xml:space="preserve">bfs_search</w:t>
+              <w:t xml:space="preserve">adjacency_to_list</w:t>
             </w:r>
             <w:r>
               <w:rPr>
@@ -20047,7 +21338,7 @@
                 <w:rStyle w:val="VerbatimChar"/>
                 <w:sz w:val="18"/>
               </w:rPr>
-              <w:t xml:space="preserve">bridge_channels</w:t>
+              <w:t xml:space="preserve">arcs_to_adjacency</w:t>
             </w:r>
             <w:r>
               <w:rPr>
@@ -20066,7 +21357,7 @@
                 <w:rStyle w:val="VerbatimChar"/>
                 <w:sz w:val="18"/>
               </w:rPr>
-              <w:t xml:space="preserve">check_picture_files</w:t>
+              <w:t xml:space="preserve">arrow_points</w:t>
             </w:r>
             <w:r>
               <w:rPr>
@@ -20085,7 +21376,7 @@
                 <w:rStyle w:val="VerbatimChar"/>
                 <w:sz w:val="18"/>
               </w:rPr>
-              <w:t xml:space="preserve">connected_components</w:t>
+              <w:t xml:space="preserve">bfs_search</w:t>
             </w:r>
             <w:r>
               <w:rPr>
@@ -20104,7 +21395,7 @@
                 <w:rStyle w:val="VerbatimChar"/>
                 <w:sz w:val="18"/>
               </w:rPr>
-              <w:t xml:space="preserve">cut_users</w:t>
+              <w:t xml:space="preserve">bridge_channels</w:t>
             </w:r>
             <w:r>
               <w:rPr>
@@ -20123,7 +21414,7 @@
                 <w:rStyle w:val="VerbatimChar"/>
                 <w:sz w:val="18"/>
               </w:rPr>
-              <w:t xml:space="preserve">cycle_rank</w:t>
+              <w:t xml:space="preserve">check_picture_files</w:t>
             </w:r>
             <w:r>
               <w:rPr>
@@ -20142,7 +21433,7 @@
                 <w:rStyle w:val="VerbatimChar"/>
                 <w:sz w:val="18"/>
               </w:rPr>
-              <w:t xml:space="preserve">define_graph</w:t>
+              <w:t xml:space="preserve">connected_components</w:t>
             </w:r>
             <w:r>
               <w:rPr>
@@ -20161,7 +21452,7 @@
                 <w:rStyle w:val="VerbatimChar"/>
                 <w:sz w:val="18"/>
               </w:rPr>
-              <w:t xml:space="preserve">distance_matrix</w:t>
+              <w:t xml:space="preserve">cut_users</w:t>
             </w:r>
             <w:r>
               <w:rPr>
@@ -20180,7 +21471,7 @@
                 <w:rStyle w:val="VerbatimChar"/>
                 <w:sz w:val="18"/>
               </w:rPr>
-              <w:t xml:space="preserve">draw_network</w:t>
+              <w:t xml:space="preserve">cycle_rank</w:t>
             </w:r>
             <w:r>
               <w:rPr>
@@ -20199,7 +21490,7 @@
                 <w:rStyle w:val="VerbatimChar"/>
                 <w:sz w:val="18"/>
               </w:rPr>
-              <w:t xml:space="preserve">edges_to_adjacency</w:t>
+              <w:t xml:space="preserve">define_digraph</w:t>
             </w:r>
             <w:r>
               <w:rPr>
@@ -20218,7 +21509,7 @@
                 <w:rStyle w:val="VerbatimChar"/>
                 <w:sz w:val="18"/>
               </w:rPr>
-              <w:t xml:space="preserve">find_cycle</w:t>
+              <w:t xml:space="preserve">define_graph</w:t>
             </w:r>
             <w:r>
               <w:rPr>
@@ -20237,7 +21528,7 @@
                 <w:rStyle w:val="VerbatimChar"/>
                 <w:sz w:val="18"/>
               </w:rPr>
-              <w:t xml:space="preserve">format_groups</w:t>
+              <w:t xml:space="preserve">digraph_options</w:t>
             </w:r>
             <w:r>
               <w:rPr>
@@ -20256,7 +21547,7 @@
                 <w:rStyle w:val="VerbatimChar"/>
                 <w:sz w:val="18"/>
               </w:rPr>
-              <w:t xml:space="preserve">format_names</w:t>
+              <w:t xml:space="preserve">distance_matrix</w:t>
             </w:r>
             <w:r>
               <w:rPr>
@@ -20275,7 +21566,7 @@
                 <w:rStyle w:val="VerbatimChar"/>
                 <w:sz w:val="18"/>
               </w:rPr>
-              <w:t xml:space="preserve">graph_layout</w:t>
+              <w:t xml:space="preserve">draw_digraph</w:t>
             </w:r>
             <w:r>
               <w:rPr>
@@ -20294,7 +21585,7 @@
                 <w:rStyle w:val="VerbatimChar"/>
                 <w:sz w:val="18"/>
               </w:rPr>
-              <w:t xml:space="preserve">is_connected</w:t>
+              <w:t xml:space="preserve">draw_network</w:t>
             </w:r>
             <w:r>
               <w:rPr>
@@ -20313,7 +21604,7 @@
                 <w:rStyle w:val="VerbatimChar"/>
                 <w:sz w:val="18"/>
               </w:rPr>
-              <w:t xml:space="preserve">list_to_adjacency</w:t>
+              <w:t xml:space="preserve">edges_to_adjacency</w:t>
             </w:r>
             <w:r>
               <w:rPr>
@@ -20332,7 +21623,7 @@
                 <w:rStyle w:val="VerbatimChar"/>
                 <w:sz w:val="18"/>
               </w:rPr>
-              <w:t xml:space="preserve">mark_edges</w:t>
+              <w:t xml:space="preserve">find_cycle</w:t>
             </w:r>
             <w:r>
               <w:rPr>
@@ -20351,7 +21642,7 @@
                 <w:rStyle w:val="VerbatimChar"/>
                 <w:sz w:val="18"/>
               </w:rPr>
-              <w:t xml:space="preserve">path_to_edges</w:t>
+              <w:t xml:space="preserve">format_groups</w:t>
             </w:r>
             <w:r>
               <w:rPr>
@@ -20370,7 +21661,7 @@
                 <w:rStyle w:val="VerbatimChar"/>
                 <w:sz w:val="18"/>
               </w:rPr>
-              <w:t xml:space="preserve">picture_options</w:t>
+              <w:t xml:space="preserve">format_names</w:t>
             </w:r>
             <w:r>
               <w:rPr>
@@ -20389,7 +21680,7 @@
                 <w:rStyle w:val="VerbatimChar"/>
                 <w:sz w:val="18"/>
               </w:rPr>
-              <w:t xml:space="preserve">plural_s</w:t>
+              <w:t xml:space="preserve">graph_layout</w:t>
             </w:r>
             <w:r>
               <w:rPr>
@@ -20408,7 +21699,7 @@
                 <w:rStyle w:val="VerbatimChar"/>
                 <w:sz w:val="18"/>
               </w:rPr>
-              <w:t xml:space="preserve">reachable_from</w:t>
+              <w:t xml:space="preserve">is_connected</w:t>
             </w:r>
             <w:r>
               <w:rPr>
@@ -20427,7 +21718,7 @@
                 <w:rStyle w:val="VerbatimChar"/>
                 <w:sz w:val="18"/>
               </w:rPr>
-              <w:t xml:space="preserve">remove_channel</w:t>
+              <w:t xml:space="preserve">is_strongly_connected</w:t>
             </w:r>
             <w:r>
               <w:rPr>
@@ -20446,7 +21737,7 @@
                 <w:rStyle w:val="VerbatimChar"/>
                 <w:sz w:val="18"/>
               </w:rPr>
-              <w:t xml:space="preserve">remove_user</w:t>
+              <w:t xml:space="preserve">list_to_adjacency</w:t>
             </w:r>
             <w:r>
               <w:rPr>
@@ -20465,7 +21756,7 @@
                 <w:rStyle w:val="VerbatimChar"/>
                 <w:sz w:val="18"/>
               </w:rPr>
-              <w:t xml:space="preserve">save_network_pictures</w:t>
+              <w:t xml:space="preserve">mark_edges</w:t>
             </w:r>
             <w:r>
               <w:rPr>
@@ -20484,7 +21775,7 @@
                 <w:rStyle w:val="VerbatimChar"/>
                 <w:sz w:val="18"/>
               </w:rPr>
-              <w:t xml:space="preserve">shortest_path</w:t>
+              <w:t xml:space="preserve">path_to_arcs</w:t>
             </w:r>
             <w:r>
               <w:rPr>
@@ -20503,27 +21794,26 @@
                 <w:rStyle w:val="VerbatimChar"/>
                 <w:sz w:val="18"/>
               </w:rPr>
-              <w:t xml:space="preserve">yes_no</w:t>
-            </w:r>
-          </w:p>
-        </w:tc>
-        <w:tc>
-          <w:tcPr>
-            <w:tcW w:type="dxa" w:w="3613"/>
-          </w:tcPr>
-          <w:p>
-            <w:pPr>
-              <w:pStyle w:val="Compact"/>
-              <w:keepNext/>
-              <w:spacing w:after="20" w:line="240" w:lineRule="auto"/>
-              <w:jc w:val="left"/>
-            </w:pPr>
+              <w:t xml:space="preserve">path_to_edges</w:t>
+            </w:r>
+            <w:r>
+              <w:rPr>
+                <w:sz w:val="20"/>
+              </w:rPr>
+              <w:t xml:space="preserve">,</w:t>
+            </w:r>
+            <w:r>
+              <w:rPr>
+                <w:sz w:val="20"/>
+              </w:rPr>
+              <w:t xml:space="preserve"> </w:t>
+            </w:r>
             <w:r>
               <w:rPr>
                 <w:rStyle w:val="VerbatimChar"/>
                 <w:sz w:val="18"/>
               </w:rPr>
-              <w:t xml:space="preserve">demo_point2</w:t>
+              <w:t xml:space="preserve">picture_options</w:t>
             </w:r>
             <w:r>
               <w:rPr>
@@ -20542,7 +21832,236 @@
                 <w:rStyle w:val="VerbatimChar"/>
                 <w:sz w:val="18"/>
               </w:rPr>
+              <w:t xml:space="preserve">plural_s</w:t>
+            </w:r>
+            <w:r>
+              <w:rPr>
+                <w:sz w:val="20"/>
+              </w:rPr>
+              <w:t xml:space="preserve">,</w:t>
+            </w:r>
+            <w:r>
+              <w:rPr>
+                <w:sz w:val="20"/>
+              </w:rPr>
+              <w:t xml:space="preserve"> </w:t>
+            </w:r>
+            <w:r>
+              <w:rPr>
+                <w:rStyle w:val="VerbatimChar"/>
+                <w:sz w:val="18"/>
+              </w:rPr>
+              <w:t xml:space="preserve">reachable_from</w:t>
+            </w:r>
+            <w:r>
+              <w:rPr>
+                <w:sz w:val="20"/>
+              </w:rPr>
+              <w:t xml:space="preserve">,</w:t>
+            </w:r>
+            <w:r>
+              <w:rPr>
+                <w:sz w:val="20"/>
+              </w:rPr>
+              <w:t xml:space="preserve"> </w:t>
+            </w:r>
+            <w:r>
+              <w:rPr>
+                <w:rStyle w:val="VerbatimChar"/>
+                <w:sz w:val="18"/>
+              </w:rPr>
+              <w:t xml:space="preserve">remove_channel</w:t>
+            </w:r>
+            <w:r>
+              <w:rPr>
+                <w:sz w:val="20"/>
+              </w:rPr>
+              <w:t xml:space="preserve">,</w:t>
+            </w:r>
+            <w:r>
+              <w:rPr>
+                <w:sz w:val="20"/>
+              </w:rPr>
+              <w:t xml:space="preserve"> </w:t>
+            </w:r>
+            <w:r>
+              <w:rPr>
+                <w:rStyle w:val="VerbatimChar"/>
+                <w:sz w:val="18"/>
+              </w:rPr>
+              <w:t xml:space="preserve">remove_user</w:t>
+            </w:r>
+            <w:r>
+              <w:rPr>
+                <w:sz w:val="20"/>
+              </w:rPr>
+              <w:t xml:space="preserve">,</w:t>
+            </w:r>
+            <w:r>
+              <w:rPr>
+                <w:sz w:val="20"/>
+              </w:rPr>
+              <w:t xml:space="preserve"> </w:t>
+            </w:r>
+            <w:r>
+              <w:rPr>
+                <w:rStyle w:val="VerbatimChar"/>
+                <w:sz w:val="18"/>
+              </w:rPr>
+              <w:t xml:space="preserve">save_digraph_pictures</w:t>
+            </w:r>
+            <w:r>
+              <w:rPr>
+                <w:sz w:val="20"/>
+              </w:rPr>
+              <w:t xml:space="preserve">,</w:t>
+            </w:r>
+            <w:r>
+              <w:rPr>
+                <w:sz w:val="20"/>
+              </w:rPr>
+              <w:t xml:space="preserve"> </w:t>
+            </w:r>
+            <w:r>
+              <w:rPr>
+                <w:rStyle w:val="VerbatimChar"/>
+                <w:sz w:val="18"/>
+              </w:rPr>
+              <w:t xml:space="preserve">save_network_pictures</w:t>
+            </w:r>
+            <w:r>
+              <w:rPr>
+                <w:sz w:val="20"/>
+              </w:rPr>
+              <w:t xml:space="preserve">,</w:t>
+            </w:r>
+            <w:r>
+              <w:rPr>
+                <w:sz w:val="20"/>
+              </w:rPr>
+              <w:t xml:space="preserve"> </w:t>
+            </w:r>
+            <w:r>
+              <w:rPr>
+                <w:rStyle w:val="VerbatimChar"/>
+                <w:sz w:val="18"/>
+              </w:rPr>
+              <w:t xml:space="preserve">shortest_path</w:t>
+            </w:r>
+            <w:r>
+              <w:rPr>
+                <w:sz w:val="20"/>
+              </w:rPr>
+              <w:t xml:space="preserve">,</w:t>
+            </w:r>
+            <w:r>
+              <w:rPr>
+                <w:sz w:val="20"/>
+              </w:rPr>
+              <w:t xml:space="preserve"> </w:t>
+            </w:r>
+            <w:r>
+              <w:rPr>
+                <w:rStyle w:val="VerbatimChar"/>
+                <w:sz w:val="18"/>
+              </w:rPr>
+              <w:t xml:space="preserve">strong_components</w:t>
+            </w:r>
+            <w:r>
+              <w:rPr>
+                <w:sz w:val="20"/>
+              </w:rPr>
+              <w:t xml:space="preserve">,</w:t>
+            </w:r>
+            <w:r>
+              <w:rPr>
+                <w:sz w:val="20"/>
+              </w:rPr>
+              <w:t xml:space="preserve"> </w:t>
+            </w:r>
+            <w:r>
+              <w:rPr>
+                <w:rStyle w:val="VerbatimChar"/>
+                <w:sz w:val="18"/>
+              </w:rPr>
+              <w:t xml:space="preserve">yes_no</w:t>
+            </w:r>
+          </w:p>
+        </w:tc>
+        <w:tc>
+          <w:tcPr>
+            <w:tcW w:type="dxa" w:w="3613"/>
+          </w:tcPr>
+          <w:p>
+            <w:pPr>
+              <w:pStyle w:val="Compact"/>
+              <w:keepNext/>
+              <w:spacing w:after="20" w:line="240" w:lineRule="auto"/>
+              <w:jc w:val="left"/>
+            </w:pPr>
+            <w:r>
+              <w:rPr>
+                <w:rStyle w:val="VerbatimChar"/>
+                <w:sz w:val="18"/>
+              </w:rPr>
+              <w:t xml:space="preserve">demo_point2</w:t>
+            </w:r>
+            <w:r>
+              <w:rPr>
+                <w:sz w:val="20"/>
+              </w:rPr>
+              <w:t xml:space="preserve">,</w:t>
+            </w:r>
+            <w:r>
+              <w:rPr>
+                <w:sz w:val="20"/>
+              </w:rPr>
+              <w:t xml:space="preserve"> </w:t>
+            </w:r>
+            <w:r>
+              <w:rPr>
+                <w:rStyle w:val="VerbatimChar"/>
+                <w:sz w:val="18"/>
+              </w:rPr>
+              <w:t xml:space="preserve">demo_point2d</w:t>
+            </w:r>
+            <w:r>
+              <w:rPr>
+                <w:sz w:val="20"/>
+              </w:rPr>
+              <w:t xml:space="preserve">,</w:t>
+            </w:r>
+            <w:r>
+              <w:rPr>
+                <w:sz w:val="20"/>
+              </w:rPr>
+              <w:t xml:space="preserve"> </w:t>
+            </w:r>
+            <w:r>
+              <w:rPr>
+                <w:rStyle w:val="VerbatimChar"/>
+                <w:sz w:val="18"/>
+              </w:rPr>
               <w:t xml:space="preserve">show_analysis</w:t>
+            </w:r>
+            <w:r>
+              <w:rPr>
+                <w:sz w:val="20"/>
+              </w:rPr>
+              <w:t xml:space="preserve">,</w:t>
+            </w:r>
+            <w:r>
+              <w:rPr>
+                <w:sz w:val="20"/>
+              </w:rPr>
+              <w:t xml:space="preserve"> </w:t>
+            </w:r>
+            <w:r>
+              <w:rPr>
+                <w:rStyle w:val="VerbatimChar"/>
+                <w:sz w:val="18"/>
+              </w:rPr>
+              <w:t xml:space="preserve">show_digraph</w:t>
             </w:r>
             <w:r>
               <w:rPr>
@@ -21986,7 +23505,7 @@
         </w:tc>
       </w:tr>
     </w:tbl>
-    <w:bookmarkEnd w:id="90"/>
+    <w:bookmarkEnd w:id="100"/>
     <w:sectPr>
       <w:footerReference w:type="default" r:id="rId9"/>
       <w:pgSz w:w="11906" w:h="16838"/>

</xml_diff>

<commit_message>
Add final technical report and real MATLAB figures
Replace the 9 stand-in report figures with the PNG files saved from
MATLAB (demo_point2, demo_point2d and main_demo), and add the final
Technical_Report (.md source, .docx and .pdf) and the updated
report_figures README.

Co-Authored-By: Claude Sonnet 5.5 <noreply@anthropic.com>
Claude-Session: https://claude.ai/code/session_015cYhbsxcKsNKUHpJ6skSiX
</commit_message>
<xml_diff>
--- a/docs/Technical_Report.docx
+++ b/docs/Technical_Report.docx
@@ -877,7 +877,7 @@
           <w:sz w:val="22"/>
         </w:rPr>
         <w:tab/>
-        <w:t>16</w:t>
+        <w:t>17</w:t>
       </w:r>
     </w:p>
     <w:p>
@@ -11304,7 +11304,7 @@
         <w:pStyle w:val="FirstParagraph"/>
       </w:pPr>
       <w:r>
-        <w:t xml:space="preserve">Every part has a test file of automatic checks that print PASS or FAIL lines. All 15 test files that need no figure window were run in GNU Octave 8.4 and every check passed.</w:t>
+        <w:t xml:space="preserve">Every part has a test file of automatic checks that print PASS or FAIL lines. All 15 test files that need no figure window were run in GNU Octave 8.4 and every check passed (Table 3); the full suite was also run in MATLAB Online (see below the table).</w:t>
       </w:r>
     </w:p>
     <w:p>
@@ -12430,6 +12430,81 @@
         <w:t xml:space="preserve">test_graph_analysis</w:t>
       </w:r>
       <w:r>
+        <w:t xml:space="preserve"> </w:t>
+      </w:r>
+      <w:r>
+        <w:t xml:space="preserve">120 checks,</w:t>
+      </w:r>
+      <w:r>
+        <w:t xml:space="preserve"> </w:t>
+      </w:r>
+      <w:r>
+        <w:rPr>
+          <w:rStyle w:val="VerbatimChar"/>
+        </w:rPr>
+        <w:t xml:space="preserve">test_graph_pictures</w:t>
+      </w:r>
+      <w:r>
+        <w:t xml:space="preserve"> </w:t>
+      </w:r>
+      <w:r>
+        <w:t xml:space="preserve">129,</w:t>
+      </w:r>
+      <w:r>
+        <w:t xml:space="preserve"> </w:t>
+      </w:r>
+      <w:r>
+        <w:rPr>
+          <w:rStyle w:val="VerbatimChar"/>
+        </w:rPr>
+        <w:t xml:space="preserve">test_digraph_pictures</w:t>
+      </w:r>
+      <w:r>
+        <w:t xml:space="preserve"> </w:t>
+      </w:r>
+      <w:r>
+        <w:t xml:space="preserve">26 and</w:t>
+      </w:r>
+      <w:r>
+        <w:t xml:space="preserve"> </w:t>
+      </w:r>
+      <w:r>
+        <w:rPr>
+          <w:rStyle w:val="VerbatimChar"/>
+        </w:rPr>
+        <w:t xml:space="preserve">test_route_picture</w:t>
+      </w:r>
+      <w:r>
+        <w:t xml:space="preserve"> </w:t>
+      </w:r>
+      <w:r>
+        <w:t xml:space="preserve">64) draw figures, so they were not part of the Octave run above. The whole suite,</w:t>
+      </w:r>
+      <w:r>
+        <w:t xml:space="preserve"> </w:t>
+      </w:r>
+      <w:r>
+        <w:rPr>
+          <w:rStyle w:val="VerbatimChar"/>
+        </w:rPr>
+        <w:t xml:space="preserve">run_all_tests</w:t>
+      </w:r>
+      <w:r>
+        <w:t xml:space="preserve"> </w:t>
+      </w:r>
+      <w:r>
+        <w:t xml:space="preserve">with all 19 test files, was run in MATLAB Online and ended with ALL TESTS PASSED (1,196 + 339 = 1,535 checks in all). The demos</w:t>
+      </w:r>
+      <w:r>
+        <w:t xml:space="preserve"> </w:t>
+      </w:r>
+      <w:r>
+        <w:rPr>
+          <w:rStyle w:val="VerbatimChar"/>
+        </w:rPr>
+        <w:t xml:space="preserve">demo_point2</w:t>
+      </w:r>
+      <w:r>
         <w:t xml:space="preserve">,</w:t>
       </w:r>
       <w:r>
@@ -12439,10 +12514,13 @@
         <w:rPr>
           <w:rStyle w:val="VerbatimChar"/>
         </w:rPr>
-        <w:t xml:space="preserve">test_graph_pictures</w:t>
-      </w:r>
-      <w:r>
-        <w:t xml:space="preserve">,</w:t>
+        <w:t xml:space="preserve">demo_point2d</w:t>
+      </w:r>
+      <w:r>
+        <w:t xml:space="preserve"> </w:t>
+      </w:r>
+      <w:r>
+        <w:t xml:space="preserve">and</w:t>
       </w:r>
       <w:r>
         <w:t xml:space="preserve"> </w:t>
@@ -12451,40 +12529,13 @@
         <w:rPr>
           <w:rStyle w:val="VerbatimChar"/>
         </w:rPr>
-        <w:t xml:space="preserve">test_digraph_pictures</w:t>
-      </w:r>
-      <w:r>
-        <w:t xml:space="preserve"> </w:t>
-      </w:r>
-      <w:r>
-        <w:t xml:space="preserve">and</w:t>
-      </w:r>
-      <w:r>
-        <w:t xml:space="preserve"> </w:t>
-      </w:r>
-      <w:r>
-        <w:rPr>
-          <w:rStyle w:val="VerbatimChar"/>
-        </w:rPr>
-        <w:t xml:space="preserve">test_route_picture</w:t>
-      </w:r>
-      <w:r>
-        <w:t xml:space="preserve">) draw figures and are run in MATLAB by the team.</w:t>
-      </w:r>
-      <w:r>
-        <w:t xml:space="preserve"> </w:t>
-      </w:r>
-      <w:r>
-        <w:rPr>
-          <w:rStyle w:val="VerbatimChar"/>
-        </w:rPr>
-        <w:t xml:space="preserve">test_digraph_pictures</w:t>
-      </w:r>
-      <w:r>
-        <w:t xml:space="preserve"> </w:t>
-      </w:r>
-      <w:r>
-        <w:t xml:space="preserve">(26 checks) was also run once in GNU Octave with the gnuplot graphics toolkit, where all 26 passed; this is not a MATLAB run. The tests never write into the</w:t>
+        <w:t xml:space="preserve">main_demo</w:t>
+      </w:r>
+      <w:r>
+        <w:t xml:space="preserve"> </w:t>
+      </w:r>
+      <w:r>
+        <w:t xml:space="preserve">were also run in MATLAB Online, and Figures 6 to 14 are the PNG files they saved. The tests never write into the</w:t>
       </w:r>
       <w:r>
         <w:t xml:space="preserve"> </w:t>
@@ -18224,7 +18275,7 @@
         <w:t xml:space="preserve"> </w:t>
       </w:r>
       <w:r>
-        <w:t xml:space="preserve">ends with eight checks, and all of them say yes in the Octave run. One of them compares the reachable users found by breadth-first search with those found by Warshall’s algorithm, and another compares the strong components with the groups found from the Warshall matrix. The tests also check the numbers above, the refusal of bad arc lists, a digraph with all channels two-way (strongly connected, symmetric matrix) and a digraph with only one-way channels (six components of one user each).</w:t>
+        <w:t xml:space="preserve">ends with eight checks, and all of them say yes, both in the Octave run and in the MATLAB Online run. One of them compares the reachable users found by breadth-first search with those found by Warshall’s algorithm, and another compares the strong components with the groups found from the Warshall matrix. The tests also check the numbers above, the refusal of bad arc lists, a digraph with all channels two-way (strongly connected, symmetric matrix) and a digraph with only one-way channels (six components of one user each).</w:t>
       </w:r>
     </w:p>
     <w:bookmarkEnd w:id="66"/>
@@ -18307,153 +18358,12 @@
     </w:p>
     <w:p>
       <w:pPr>
-        <w:pStyle w:val="BodyText"/>
-      </w:pPr>
-      <w:r>
-        <w:rPr>
-          <w:iCs/>
-          <w:i/>
-        </w:rPr>
-        <w:t xml:space="preserve">Note on these figures.</w:t>
-      </w:r>
-      <w:r>
-        <w:t xml:space="preserve"> </w:t>
-      </w:r>
-      <w:r>
-        <w:t xml:space="preserve">Figures 12 to 14 are the PNG files that the project function</w:t>
-      </w:r>
-      <w:r>
-        <w:t xml:space="preserve"> </w:t>
-      </w:r>
-      <w:r>
-        <w:rPr>
-          <w:rStyle w:val="VerbatimChar"/>
-        </w:rPr>
-        <w:t xml:space="preserve">save_digraph_pictures</w:t>
-      </w:r>
-      <w:r>
-        <w:t xml:space="preserve"> </w:t>
-      </w:r>
-      <w:r>
-        <w:t xml:space="preserve">wrote when it was run in GNU Octave with the gnuplot graphics toolkit; they are drawn by the real drawing code but not by MATLAB, and they will be replaced by the PNG files of</w:t>
-      </w:r>
-      <w:r>
-        <w:t xml:space="preserve"> </w:t>
-      </w:r>
-      <w:r>
-        <w:rPr>
-          <w:rStyle w:val="VerbatimChar"/>
-        </w:rPr>
-        <w:t xml:space="preserve">demo_point2d</w:t>
-      </w:r>
-      <w:r>
-        <w:t xml:space="preserve"> </w:t>
-      </w:r>
-      <w:r>
-        <w:t xml:space="preserve">after the run on the demo laptop. The six other pictures in this version of the report were not copied from MATLAB windows. A separate plotting script (</w:t>
-      </w:r>
-      <w:r>
-        <w:rPr>
-          <w:rStyle w:val="VerbatimChar"/>
-        </w:rPr>
-        <w:t xml:space="preserve">handoff/make_figures.py</w:t>
-      </w:r>
-      <w:r>
-        <w:t xml:space="preserve">) drew them from the places, colors, line widths and titles that the MATLAB functions</w:t>
-      </w:r>
-      <w:r>
-        <w:t xml:space="preserve"> </w:t>
-      </w:r>
-      <w:r>
-        <w:rPr>
-          <w:rStyle w:val="VerbatimChar"/>
-        </w:rPr>
-        <w:t xml:space="preserve">graph_layout</w:t>
-      </w:r>
-      <w:r>
-        <w:t xml:space="preserve">,</w:t>
-      </w:r>
-      <w:r>
-        <w:t xml:space="preserve"> </w:t>
-      </w:r>
-      <w:r>
-        <w:rPr>
-          <w:rStyle w:val="VerbatimChar"/>
-        </w:rPr>
-        <w:t xml:space="preserve">picture_options</w:t>
-      </w:r>
-      <w:r>
-        <w:t xml:space="preserve"> </w:t>
-      </w:r>
-      <w:r>
-        <w:t xml:space="preserve">and</w:t>
-      </w:r>
-      <w:r>
-        <w:t xml:space="preserve"> </w:t>
-      </w:r>
-      <w:r>
-        <w:rPr>
-          <w:rStyle w:val="VerbatimChar"/>
-        </w:rPr>
-        <w:t xml:space="preserve">route_picture_options</w:t>
-      </w:r>
-      <w:r>
-        <w:t xml:space="preserve"> </w:t>
-      </w:r>
-      <w:r>
-        <w:t xml:space="preserve">compute (these values were read out with GNU Octave, which cannot open figure windows). They have the layout and the colors of</w:t>
-      </w:r>
-      <w:r>
-        <w:t xml:space="preserve"> </w:t>
-      </w:r>
-      <w:r>
-        <w:rPr>
-          <w:rStyle w:val="VerbatimChar"/>
-        </w:rPr>
-        <w:t xml:space="preserve">draw_network</w:t>
-      </w:r>
-      <w:r>
-        <w:t xml:space="preserve">, and they will be replaced by the PNG files that</w:t>
-      </w:r>
-      <w:r>
-        <w:t xml:space="preserve"> </w:t>
-      </w:r>
-      <w:r>
-        <w:rPr>
-          <w:rStyle w:val="VerbatimChar"/>
-        </w:rPr>
-        <w:t xml:space="preserve">demo_point2</w:t>
-      </w:r>
-      <w:r>
-        <w:t xml:space="preserve"> </w:t>
-      </w:r>
-      <w:r>
-        <w:t xml:space="preserve">and</w:t>
-      </w:r>
-      <w:r>
-        <w:t xml:space="preserve"> </w:t>
-      </w:r>
-      <w:r>
-        <w:rPr>
-          <w:rStyle w:val="VerbatimChar"/>
-        </w:rPr>
-        <w:t xml:space="preserve">main_demo</w:t>
-      </w:r>
-      <w:r>
-        <w:t xml:space="preserve"> </w:t>
-      </w:r>
-      <w:r>
-        <w:t xml:space="preserve">save in MATLAB (same file names) after the run on the demo laptop.</w:t>
-      </w:r>
-    </w:p>
-    <w:p>
-      <w:pPr>
         <w:pStyle w:val="CaptionedFigure"/>
       </w:pPr>
       <w:r>
         <w:drawing>
           <wp:inline>
-            <wp:extent cx="5039999" cy="1867596"/>
+            <wp:extent cx="5039999" cy="1869850"/>
             <wp:effectExtent b="0" l="0" r="0" t="0"/>
             <wp:docPr descr="Figure 6. The communication network: the users are the vertices and the six channels are the edges (point2_network.png)." title="" id="68" name="Picture"/>
             <a:graphic>
@@ -18474,7 +18384,7 @@
                   <pic:spPr bwMode="auto">
                     <a:xfrm>
                       <a:off x="0" y="0"/>
-                      <a:ext cx="5039999" cy="1867596"/>
+                      <a:ext cx="5039999" cy="1869850"/>
                     </a:xfrm>
                     <a:prstGeom prst="rect">
                       <a:avLst/>
@@ -18517,7 +18427,7 @@
       <w:r>
         <w:drawing>
           <wp:inline>
-            <wp:extent cx="5039999" cy="1867596"/>
+            <wp:extent cx="5039999" cy="1869850"/>
             <wp:effectExtent b="0" l="0" r="0" t="0"/>
             <wp:docPr descr="Figure 7. The shortest path from Alice to Grace: Alice – Bob – Dave – Frank – Grace, 4 channels (point2_shortest_path.png)." title="" id="71" name="Picture"/>
             <a:graphic>
@@ -18538,7 +18448,7 @@
                   <pic:spPr bwMode="auto">
                     <a:xfrm>
                       <a:off x="0" y="0"/>
-                      <a:ext cx="5039999" cy="1867596"/>
+                      <a:ext cx="5039999" cy="1869850"/>
                     </a:xfrm>
                     <a:prstGeom prst="rect">
                       <a:avLst/>
@@ -18581,7 +18491,7 @@
       <w:r>
         <w:drawing>
           <wp:inline>
-            <wp:extent cx="5039999" cy="1867596"/>
+            <wp:extent cx="5039999" cy="1869850"/>
             <wp:effectExtent b="0" l="0" r="0" t="0"/>
             <wp:docPr descr="Figure 8. A shortest cycle: Alice – Bob – Dave – Carol – Alice, length 4. The network has exactly one independent cycle, since 6 channels − 6 users + 1 group = 1 (point2_cycle.png)." title="" id="74" name="Picture"/>
             <a:graphic>
@@ -18602,7 +18512,7 @@
                   <pic:spPr bwMode="auto">
                     <a:xfrm>
                       <a:off x="0" y="0"/>
-                      <a:ext cx="5039999" cy="1867596"/>
+                      <a:ext cx="5039999" cy="1869850"/>
                     </a:xfrm>
                     <a:prstGeom prst="rect">
                       <a:avLst/>
@@ -18645,7 +18555,7 @@
       <w:r>
         <w:drawing>
           <wp:inline>
-            <wp:extent cx="5039999" cy="1867596"/>
+            <wp:extent cx="5039999" cy="1869850"/>
             <wp:effectExtent b="0" l="0" r="0" t="0"/>
             <wp:docPr descr="Figure 9. The weak points: the bridge channels Dave – Frank (e5) and Frank – Grace (e6) are red, and the cut users Dave and Frank are orange (point2_weak_points.png)." title="" id="77" name="Picture"/>
             <a:graphic>
@@ -18666,7 +18576,7 @@
                   <pic:spPr bwMode="auto">
                     <a:xfrm>
                       <a:off x="0" y="0"/>
-                      <a:ext cx="5039999" cy="1867596"/>
+                      <a:ext cx="5039999" cy="1869850"/>
                     </a:xfrm>
                     <a:prstGeom prst="rect">
                       <a:avLst/>
@@ -18709,7 +18619,7 @@
       <w:r>
         <w:drawing>
           <wp:inline>
-            <wp:extent cx="5039999" cy="1867596"/>
+            <wp:extent cx="5039999" cy="1869850"/>
             <wp:effectExtent b="0" l="0" r="0" t="0"/>
             <wp:docPr descr="Figure 10. The network after the bridge channel Dave – Frank is removed (dotted): two groups of users, {Alice, Bob, Carol, Dave} and {Frank, Grace}, one color each (point2_split.png)." title="" id="80" name="Picture"/>
             <a:graphic>
@@ -18730,7 +18640,7 @@
                   <pic:spPr bwMode="auto">
                     <a:xfrm>
                       <a:off x="0" y="0"/>
-                      <a:ext cx="5039999" cy="1867596"/>
+                      <a:ext cx="5039999" cy="1869850"/>
                     </a:xfrm>
                     <a:prstGeom prst="rect">
                       <a:avLst/>
@@ -18773,7 +18683,7 @@
       <w:r>
         <w:drawing>
           <wp:inline>
-            <wp:extent cx="5039999" cy="1867596"/>
+            <wp:extent cx="5039999" cy="1869850"/>
             <wp:effectExtent b="0" l="0" r="0" t="0"/>
             <wp:docPr descr="Figure 11. The route of the message from Alice to Grace in main_demo (option 7). The thick green channels e1, e3, e5 and e6 carry it with the keys 85, 42, 32 and 72; Alice and Grace are dark green, Bob, Dave and Frank light green, and Carol is not on the route (point5_route.png)." title="" id="83" name="Picture"/>
             <a:graphic>
@@ -18794,7 +18704,7 @@
                   <pic:spPr bwMode="auto">
                     <a:xfrm>
                       <a:off x="0" y="0"/>
-                      <a:ext cx="5039999" cy="1867596"/>
+                      <a:ext cx="5039999" cy="1869850"/>
                     </a:xfrm>
                     <a:prstGeom prst="rect">
                       <a:avLst/>
@@ -18852,7 +18762,7 @@
       <w:r>
         <w:drawing>
           <wp:inline>
-            <wp:extent cx="5039999" cy="1870847"/>
+            <wp:extent cx="5039999" cy="1869850"/>
             <wp:effectExtent b="0" l="0" r="0" t="0"/>
             <wp:docPr descr="Figure 12. The directed network: the 8 arcs a1 to a8 are arrows. The two arrows of a two-way channel run side by side (gray), and the one-way channels are blue (point2d_digraph.png)." title="" id="86" name="Picture"/>
             <a:graphic>
@@ -18873,7 +18783,7 @@
                   <pic:spPr bwMode="auto">
                     <a:xfrm>
                       <a:off x="0" y="0"/>
-                      <a:ext cx="5039999" cy="1870847"/>
+                      <a:ext cx="5039999" cy="1869850"/>
                     </a:xfrm>
                     <a:prstGeom prst="rect">
                       <a:avLst/>
@@ -18916,7 +18826,7 @@
       <w:r>
         <w:drawing>
           <wp:inline>
-            <wp:extent cx="5039999" cy="1870847"/>
+            <wp:extent cx="5039999" cy="1869850"/>
             <wp:effectExtent b="0" l="0" r="0" t="0"/>
             <wp:docPr descr="Figure 13. The shortest directed path from Alice to Grace, 4 arcs (green). There is no path back from Grace to Alice (point2d_path.png)." title="" id="89" name="Picture"/>
             <a:graphic>
@@ -18937,7 +18847,7 @@
                   <pic:spPr bwMode="auto">
                     <a:xfrm>
                       <a:off x="0" y="0"/>
-                      <a:ext cx="5039999" cy="1870847"/>
+                      <a:ext cx="5039999" cy="1869850"/>
                     </a:xfrm>
                     <a:prstGeom prst="rect">
                       <a:avLst/>
@@ -18980,7 +18890,7 @@
       <w:r>
         <w:drawing>
           <wp:inline>
-            <wp:extent cx="5039999" cy="1870847"/>
+            <wp:extent cx="5039999" cy="1869850"/>
             <wp:effectExtent b="0" l="0" r="0" t="0"/>
             <wp:docPr descr="Figure 14. The strongly connected components: {Alice, Bob, Carol, Dave, Frank} and {Grace}. The only arc between the two groups, Frank → Grace, is red (point2d_strong.png)." title="" id="92" name="Picture"/>
             <a:graphic>
@@ -19001,7 +18911,7 @@
                   <pic:spPr bwMode="auto">
                     <a:xfrm>
                       <a:off x="0" y="0"/>
-                      <a:ext cx="5039999" cy="1870847"/>
+                      <a:ext cx="5039999" cy="1869850"/>
                     </a:xfrm>
                     <a:prstGeom prst="rect">
                       <a:avLst/>

</xml_diff>